<commit_message>
Dark glass theme with animated background
- Every page sits on an animated canvas: drifting aurora glows, a moving
  grid and a particle network that links to the mouse (paused when the tab
  is hidden, off for reduced motion, hidden when printing)
- Cards, tables, forms, menus, alerts and badges restyled as frosted dark
  glass with high-contrast text; native controls use the dark colour scheme
- Report and presentation refreshed with dark-theme screenshots and the
  updated colour palette

Co-Authored-By: Claude Opus 5.5 <noreply@anthropic.com>
Claude-Session: https://claude.ai/code/session_01EGrnzrfHztmX7RAaosfXYG
</commit_message>
<xml_diff>
--- a/documentation/Nexus_Documentation/Nexus_Project_Report.docx
+++ b/documentation/Nexus_Documentation/Nexus_Project_Report.docx
@@ -9173,7 +9173,7 @@
         <w:spacing w:after="120" w:line="288"/>
       </w:pPr>
       <w:r>
-        <w:t xml:space="preserve">The interface follows one design system, defined as tokens in wwwroot/css/site.css, so every screen looks and behaves the same.</w:t>
+        <w:t xml:space="preserve">The interface follows one design system, defined as tokens in wwwroot/css/site.css, so every screen looks and behaves the same. It uses a dark "glass" theme: every page sits on an animated background and the work surfaces are frosted dark glass.</w:t>
       </w:r>
     </w:p>
     <w:p>
@@ -9344,7 +9344,7 @@
               <w:bottom w:val="single" w:color="CBD5E1" w:sz="4"/>
               <w:right w:val="single" w:color="CBD5E1" w:sz="4"/>
             </w:tcBorders>
-            <w:shd w:fill="0369A1" w:color="auto" w:val="clear"/>
+            <w:shd w:fill="050F1E" w:color="auto" w:val="clear"/>
             <w:tcMar>
               <w:top w:type="dxa" w:w="70"/>
               <w:left w:type="dxa" w:w="110"/>
@@ -9387,7 +9387,7 @@
                 <w:sz w:val="19"/>
                 <w:szCs w:val="19"/>
               </w:rPr>
-              <w:t xml:space="preserve">Primary</w:t>
+              <w:t xml:space="preserve">Background</w:t>
             </w:r>
           </w:p>
         </w:tc>
@@ -9420,7 +9420,7 @@
                 <w:sz w:val="19"/>
                 <w:szCs w:val="19"/>
               </w:rPr>
-              <w:t xml:space="preserve">#0369A1</w:t>
+              <w:t xml:space="preserve">#050F1E</w:t>
             </w:r>
           </w:p>
         </w:tc>
@@ -9453,7 +9453,7 @@
                 <w:sz w:val="19"/>
                 <w:szCs w:val="19"/>
               </w:rPr>
-              <w:t xml:space="preserve">Buttons, links, active states (white text 5.9:1 contrast)</w:t>
+              <w:t xml:space="preserve">Deep navy page canvas behind the animated aurora</w:t>
             </w:r>
           </w:p>
         </w:tc>
@@ -9471,7 +9471,7 @@
               <w:bottom w:val="single" w:color="CBD5E1" w:sz="4"/>
               <w:right w:val="single" w:color="CBD5E1" w:sz="4"/>
             </w:tcBorders>
-            <w:shd w:fill="0A2540" w:color="auto" w:val="clear"/>
+            <w:shd w:fill="0D1C32" w:color="auto" w:val="clear"/>
             <w:tcMar>
               <w:top w:type="dxa" w:w="70"/>
               <w:left w:type="dxa" w:w="110"/>
@@ -9514,7 +9514,7 @@
                 <w:sz w:val="19"/>
                 <w:szCs w:val="19"/>
               </w:rPr>
-              <w:t xml:space="preserve">Stage / navy</w:t>
+              <w:t xml:space="preserve">Glass surface</w:t>
             </w:r>
           </w:p>
         </w:tc>
@@ -9547,7 +9547,7 @@
                 <w:sz w:val="19"/>
                 <w:szCs w:val="19"/>
               </w:rPr>
-              <w:t xml:space="preserve">#0A2540</w:t>
+              <w:t xml:space="preserve">rgba(13,28,50,.62)</w:t>
             </w:r>
           </w:p>
         </w:tc>
@@ -9580,7 +9580,7 @@
                 <w:sz w:val="19"/>
                 <w:szCs w:val="19"/>
               </w:rPr>
-              <w:t xml:space="preserve">Navigation bar, hero, footer</w:t>
+              <w:t xml:space="preserve">Cards, tables, forms - frosted, the background shows through</w:t>
             </w:r>
           </w:p>
         </w:tc>
@@ -9598,7 +9598,7 @@
               <w:bottom w:val="single" w:color="CBD5E1" w:sz="4"/>
               <w:right w:val="single" w:color="CBD5E1" w:sz="4"/>
             </w:tcBorders>
-            <w:shd w:fill="0EA5E9" w:color="auto" w:val="clear"/>
+            <w:shd w:fill="E2E8F0" w:color="auto" w:val="clear"/>
             <w:tcMar>
               <w:top w:type="dxa" w:w="70"/>
               <w:left w:type="dxa" w:w="110"/>
@@ -9641,7 +9641,7 @@
                 <w:sz w:val="19"/>
                 <w:szCs w:val="19"/>
               </w:rPr>
-              <w:t xml:space="preserve">Secondary</w:t>
+              <w:t xml:space="preserve">Text</w:t>
             </w:r>
           </w:p>
         </w:tc>
@@ -9674,7 +9674,7 @@
                 <w:sz w:val="19"/>
                 <w:szCs w:val="19"/>
               </w:rPr>
-              <w:t xml:space="preserve">#0EA5E9</w:t>
+              <w:t xml:space="preserve">#E2E8F0</w:t>
             </w:r>
           </w:p>
         </w:tc>
@@ -9707,7 +9707,7 @@
                 <w:sz w:val="19"/>
                 <w:szCs w:val="19"/>
               </w:rPr>
-              <w:t xml:space="preserve">Highlights, progress, focus ring</w:t>
+              <w:t xml:space="preserve">Body text (12:1 contrast on the glass)</w:t>
             </w:r>
           </w:p>
         </w:tc>
@@ -9725,7 +9725,7 @@
               <w:bottom w:val="single" w:color="CBD5E1" w:sz="4"/>
               <w:right w:val="single" w:color="CBD5E1" w:sz="4"/>
             </w:tcBorders>
-            <w:shd w:fill="059669" w:color="auto" w:val="clear"/>
+            <w:shd w:fill="7DD3FC" w:color="auto" w:val="clear"/>
             <w:tcMar>
               <w:top w:type="dxa" w:w="70"/>
               <w:left w:type="dxa" w:w="110"/>
@@ -9768,7 +9768,7 @@
                 <w:sz w:val="19"/>
                 <w:szCs w:val="19"/>
               </w:rPr>
-              <w:t xml:space="preserve">Accent</w:t>
+              <w:t xml:space="preserve">Link / highlight</w:t>
             </w:r>
           </w:p>
         </w:tc>
@@ -9801,7 +9801,7 @@
                 <w:sz w:val="19"/>
                 <w:szCs w:val="19"/>
               </w:rPr>
-              <w:t xml:space="preserve">#059669</w:t>
+              <w:t xml:space="preserve">#7DD3FC</w:t>
             </w:r>
           </w:p>
         </w:tc>
@@ -9834,7 +9834,7 @@
                 <w:sz w:val="19"/>
                 <w:szCs w:val="19"/>
               </w:rPr>
-              <w:t xml:space="preserve">Success, call to action</w:t>
+              <w:t xml:space="preserve">Links, table headers, icons</w:t>
             </w:r>
           </w:p>
         </w:tc>
@@ -9852,7 +9852,7 @@
               <w:bottom w:val="single" w:color="CBD5E1" w:sz="4"/>
               <w:right w:val="single" w:color="CBD5E1" w:sz="4"/>
             </w:tcBorders>
-            <w:shd w:fill="F0F9FF" w:color="auto" w:val="clear"/>
+            <w:shd w:fill="0369A1" w:color="auto" w:val="clear"/>
             <w:tcMar>
               <w:top w:type="dxa" w:w="70"/>
               <w:left w:type="dxa" w:w="110"/>
@@ -9895,7 +9895,7 @@
                 <w:sz w:val="19"/>
                 <w:szCs w:val="19"/>
               </w:rPr>
-              <w:t xml:space="preserve">Background</w:t>
+              <w:t xml:space="preserve">Primary</w:t>
             </w:r>
           </w:p>
         </w:tc>
@@ -9928,7 +9928,7 @@
                 <w:sz w:val="19"/>
                 <w:szCs w:val="19"/>
               </w:rPr>
-              <w:t xml:space="preserve">#F0F9FF</w:t>
+              <w:t xml:space="preserve">#0369A1</w:t>
             </w:r>
           </w:p>
         </w:tc>
@@ -9961,7 +9961,7 @@
                 <w:sz w:val="19"/>
                 <w:szCs w:val="19"/>
               </w:rPr>
-              <w:t xml:space="preserve">Page background</w:t>
+              <w:t xml:space="preserve">Buttons, active states (white text 5.9:1 contrast)</w:t>
             </w:r>
           </w:p>
         </w:tc>
@@ -9979,7 +9979,7 @@
               <w:bottom w:val="single" w:color="CBD5E1" w:sz="4"/>
               <w:right w:val="single" w:color="CBD5E1" w:sz="4"/>
             </w:tcBorders>
-            <w:shd w:fill="0F172A" w:color="auto" w:val="clear"/>
+            <w:shd w:fill="34D399" w:color="auto" w:val="clear"/>
             <w:tcMar>
               <w:top w:type="dxa" w:w="70"/>
               <w:left w:type="dxa" w:w="110"/>
@@ -10022,7 +10022,7 @@
                 <w:sz w:val="19"/>
                 <w:szCs w:val="19"/>
               </w:rPr>
-              <w:t xml:space="preserve">Text</w:t>
+              <w:t xml:space="preserve">Accent</w:t>
             </w:r>
           </w:p>
         </w:tc>
@@ -10055,7 +10055,7 @@
                 <w:sz w:val="19"/>
                 <w:szCs w:val="19"/>
               </w:rPr>
-              <w:t xml:space="preserve">#0F172A</w:t>
+              <w:t xml:space="preserve">#34D399 / #059669</w:t>
             </w:r>
           </w:p>
         </w:tc>
@@ -10088,7 +10088,7 @@
                 <w:sz w:val="19"/>
                 <w:szCs w:val="19"/>
               </w:rPr>
-              <w:t xml:space="preserve">Body text</w:t>
+              <w:t xml:space="preserve">Success, call to action</w:t>
             </w:r>
           </w:p>
         </w:tc>
@@ -10106,7 +10106,7 @@
               <w:bottom w:val="single" w:color="CBD5E1" w:sz="4"/>
               <w:right w:val="single" w:color="CBD5E1" w:sz="4"/>
             </w:tcBorders>
-            <w:shd w:fill="DC2626" w:color="auto" w:val="clear"/>
+            <w:shd w:fill="F87171" w:color="auto" w:val="clear"/>
             <w:tcMar>
               <w:top w:type="dxa" w:w="70"/>
               <w:left w:type="dxa" w:w="110"/>
@@ -10182,7 +10182,7 @@
                 <w:sz w:val="19"/>
                 <w:szCs w:val="19"/>
               </w:rPr>
-              <w:t xml:space="preserve">#DC2626</w:t>
+              <w:t xml:space="preserve">#F87171</w:t>
             </w:r>
           </w:p>
         </w:tc>
@@ -10804,7 +10804,7 @@
                 <w:sz w:val="19"/>
                 <w:szCs w:val="19"/>
               </w:rPr>
-              <w:t xml:space="preserve">Uppercase headers, row hover, coloured status badges, scroll sideways on phones</w:t>
+              <w:t xml:space="preserve">Glass background, uppercase headers, row hover, coloured status badges, scroll sideways on phones</w:t>
             </w:r>
           </w:p>
         </w:tc>
@@ -10887,6 +10887,19 @@
       </w:pPr>
       <w:r>
         <w:t xml:space="preserve">6.3 Motion and accessibility</w:t>
+      </w:r>
+    </w:p>
+    <w:p>
+      <w:pPr>
+        <w:pStyle w:val="ListParagraph"/>
+        <w:numPr>
+          <w:ilvl w:val="0"/>
+          <w:numId w:val="2"/>
+        </w:numPr>
+        <w:spacing w:after="60" w:line="276"/>
+      </w:pPr>
+      <w:r>
+        <w:t xml:space="preserve">Animated page background: slowly drifting aurora glows, a moving grid and a particle network that reacts to the mouse.</w:t>
       </w:r>
     </w:p>
     <w:p>

</xml_diff>

<commit_message>
Documentation: screenshots and design sections updated for the glass theme and clear-glass interactions
Co-Authored-By: Claude Opus 5.5 <noreply@anthropic.com>
Claude-Session: https://claude.ai/code/session_01EGrnzrfHztmX7RAaosfXYG
</commit_message>
<xml_diff>
--- a/documentation/Nexus_Documentation/Nexus_Project_Report.docx
+++ b/documentation/Nexus_Documentation/Nexus_Project_Report.docx
@@ -9580,7 +9580,7 @@
                 <w:sz w:val="19"/>
                 <w:szCs w:val="19"/>
               </w:rPr>
-              <w:t xml:space="preserve">Cards, tables, forms - frosted, the background shows through</w:t>
+              <w:t xml:space="preserve">Cards, tables, forms - frosted glass (22 px blur); turns clear on hover</w:t>
             </w:r>
           </w:p>
         </w:tc>
@@ -10938,6 +10938,19 @@
         <w:spacing w:after="60" w:line="276"/>
       </w:pPr>
       <w:r>
+        <w:t xml:space="preserve">Clear-glass interaction: clickable cards are frosted at rest; on hover or keyboard focus the frost clears, the rim lights up and the card lifts; on click it presses in and a soft light spreads from the click point.</w:t>
+      </w:r>
+    </w:p>
+    <w:p>
+      <w:pPr>
+        <w:pStyle w:val="ListParagraph"/>
+        <w:numPr>
+          <w:ilvl w:val="0"/>
+          <w:numId w:val="2"/>
+        </w:numPr>
+        <w:spacing w:after="60" w:line="276"/>
+      </w:pPr>
+      <w:r>
         <w:t xml:space="preserve">Scroll reveal and count-up figures; all motion uses transform and opacity only.</w:t>
       </w:r>
     </w:p>
@@ -10967,6 +10980,754 @@
         <w:t xml:space="preserve">Visible keyboard focus, skip-to-content link, text contrast of at least 4.5:1, labels on every field.</w:t>
       </w:r>
     </w:p>
+    <w:p>
+      <w:pPr>
+        <w:pStyle w:val="Heading2"/>
+      </w:pPr>
+      <w:r>
+        <w:t xml:space="preserve">6.4 Glass interaction states</w:t>
+      </w:r>
+    </w:p>
+    <w:tbl>
+      <w:tblPr>
+        <w:tblW w:type="dxa" w:w="9638"/>
+        <w:tblBorders>
+          <w:top w:val="single" w:color="auto" w:sz="4"/>
+          <w:left w:val="single" w:color="auto" w:sz="4"/>
+          <w:bottom w:val="single" w:color="auto" w:sz="4"/>
+          <w:right w:val="single" w:color="auto" w:sz="4"/>
+          <w:insideH w:val="single" w:color="auto" w:sz="4"/>
+          <w:insideV w:val="single" w:color="auto" w:sz="4"/>
+        </w:tblBorders>
+      </w:tblPr>
+      <w:tblGrid>
+        <w:gridCol w:w="1700"/>
+        <w:gridCol w:w="4100"/>
+        <w:gridCol w:w="3838"/>
+      </w:tblGrid>
+      <w:tr>
+        <w:trPr>
+          <w:tblHeader/>
+        </w:trPr>
+        <w:tc>
+          <w:tcPr>
+            <w:tcW w:type="dxa" w:w="1700"/>
+            <w:tcBorders>
+              <w:top w:val="single" w:color="CBD5E1" w:sz="4"/>
+              <w:left w:val="single" w:color="CBD5E1" w:sz="4"/>
+              <w:bottom w:val="single" w:color="CBD5E1" w:sz="4"/>
+              <w:right w:val="single" w:color="CBD5E1" w:sz="4"/>
+            </w:tcBorders>
+            <w:shd w:fill="0A2540" w:color="auto" w:val="clear"/>
+            <w:tcMar>
+              <w:top w:type="dxa" w:w="80"/>
+              <w:left w:type="dxa" w:w="110"/>
+              <w:bottom w:type="dxa" w:w="80"/>
+              <w:right w:type="dxa" w:w="110"/>
+            </w:tcMar>
+            <w:vAlign w:val="center"/>
+          </w:tcPr>
+          <w:p>
+            <w:r>
+              <w:rPr>
+                <w:b/>
+                <w:bCs/>
+                <w:color w:val="FFFFFF"/>
+                <w:sz w:val="19"/>
+                <w:szCs w:val="19"/>
+              </w:rPr>
+              <w:t xml:space="preserve">State</w:t>
+            </w:r>
+          </w:p>
+        </w:tc>
+        <w:tc>
+          <w:tcPr>
+            <w:tcW w:type="dxa" w:w="4100"/>
+            <w:tcBorders>
+              <w:top w:val="single" w:color="CBD5E1" w:sz="4"/>
+              <w:left w:val="single" w:color="CBD5E1" w:sz="4"/>
+              <w:bottom w:val="single" w:color="CBD5E1" w:sz="4"/>
+              <w:right w:val="single" w:color="CBD5E1" w:sz="4"/>
+            </w:tcBorders>
+            <w:shd w:fill="0A2540" w:color="auto" w:val="clear"/>
+            <w:tcMar>
+              <w:top w:type="dxa" w:w="80"/>
+              <w:left w:type="dxa" w:w="110"/>
+              <w:bottom w:type="dxa" w:w="80"/>
+              <w:right w:type="dxa" w:w="110"/>
+            </w:tcMar>
+            <w:vAlign w:val="center"/>
+          </w:tcPr>
+          <w:p>
+            <w:r>
+              <w:rPr>
+                <w:b/>
+                <w:bCs/>
+                <w:color w:val="FFFFFF"/>
+                <w:sz w:val="19"/>
+                <w:szCs w:val="19"/>
+              </w:rPr>
+              <w:t xml:space="preserve">What the user sees</w:t>
+            </w:r>
+          </w:p>
+        </w:tc>
+        <w:tc>
+          <w:tcPr>
+            <w:tcW w:type="dxa" w:w="3838"/>
+            <w:tcBorders>
+              <w:top w:val="single" w:color="CBD5E1" w:sz="4"/>
+              <w:left w:val="single" w:color="CBD5E1" w:sz="4"/>
+              <w:bottom w:val="single" w:color="CBD5E1" w:sz="4"/>
+              <w:right w:val="single" w:color="CBD5E1" w:sz="4"/>
+            </w:tcBorders>
+            <w:shd w:fill="0A2540" w:color="auto" w:val="clear"/>
+            <w:tcMar>
+              <w:top w:type="dxa" w:w="80"/>
+              <w:left w:type="dxa" w:w="110"/>
+              <w:bottom w:type="dxa" w:w="80"/>
+              <w:right w:type="dxa" w:w="110"/>
+            </w:tcMar>
+            <w:vAlign w:val="center"/>
+          </w:tcPr>
+          <w:p>
+            <w:r>
+              <w:rPr>
+                <w:b/>
+                <w:bCs/>
+                <w:color w:val="FFFFFF"/>
+                <w:sz w:val="19"/>
+                <w:szCs w:val="19"/>
+              </w:rPr>
+              <w:t xml:space="preserve">How it is built</w:t>
+            </w:r>
+          </w:p>
+        </w:tc>
+      </w:tr>
+      <w:tr>
+        <w:trPr>
+          <w:cantSplit/>
+        </w:trPr>
+        <w:tc>
+          <w:tcPr>
+            <w:tcW w:type="dxa" w:w="1700"/>
+            <w:tcBorders>
+              <w:top w:val="single" w:color="CBD5E1" w:sz="4"/>
+              <w:left w:val="single" w:color="CBD5E1" w:sz="4"/>
+              <w:bottom w:val="single" w:color="CBD5E1" w:sz="4"/>
+              <w:right w:val="single" w:color="CBD5E1" w:sz="4"/>
+            </w:tcBorders>
+            <w:shd w:fill="FFFFFF" w:color="auto" w:val="clear"/>
+            <w:tcMar>
+              <w:top w:type="dxa" w:w="70"/>
+              <w:left w:type="dxa" w:w="110"/>
+              <w:bottom w:type="dxa" w:w="70"/>
+              <w:right w:type="dxa" w:w="110"/>
+            </w:tcMar>
+          </w:tcPr>
+          <w:p>
+            <w:pPr>
+              <w:spacing w:after="0" w:line="264"/>
+            </w:pPr>
+            <w:r>
+              <w:rPr>
+                <w:b w:val="false"/>
+                <w:bCs w:val="false"/>
+                <w:color w:val="0F172A"/>
+                <w:sz w:val="19"/>
+                <w:szCs w:val="19"/>
+              </w:rPr>
+              <w:t xml:space="preserve">Rest</w:t>
+            </w:r>
+          </w:p>
+        </w:tc>
+        <w:tc>
+          <w:tcPr>
+            <w:tcW w:type="dxa" w:w="4100"/>
+            <w:tcBorders>
+              <w:top w:val="single" w:color="CBD5E1" w:sz="4"/>
+              <w:left w:val="single" w:color="CBD5E1" w:sz="4"/>
+              <w:bottom w:val="single" w:color="CBD5E1" w:sz="4"/>
+              <w:right w:val="single" w:color="CBD5E1" w:sz="4"/>
+            </w:tcBorders>
+            <w:shd w:fill="FFFFFF" w:color="auto" w:val="clear"/>
+            <w:tcMar>
+              <w:top w:type="dxa" w:w="70"/>
+              <w:left w:type="dxa" w:w="110"/>
+              <w:bottom w:type="dxa" w:w="70"/>
+              <w:right w:type="dxa" w:w="110"/>
+            </w:tcMar>
+          </w:tcPr>
+          <w:p>
+            <w:pPr>
+              <w:spacing w:after="0" w:line="264"/>
+            </w:pPr>
+            <w:r>
+              <w:rPr>
+                <w:b w:val="false"/>
+                <w:bCs w:val="false"/>
+                <w:color w:val="0F172A"/>
+                <w:sz w:val="19"/>
+                <w:szCs w:val="19"/>
+              </w:rPr>
+              <w:t xml:space="preserve">Frosted glass card, faint white rim, soft shadow</w:t>
+            </w:r>
+          </w:p>
+        </w:tc>
+        <w:tc>
+          <w:tcPr>
+            <w:tcW w:type="dxa" w:w="3838"/>
+            <w:tcBorders>
+              <w:top w:val="single" w:color="CBD5E1" w:sz="4"/>
+              <w:left w:val="single" w:color="CBD5E1" w:sz="4"/>
+              <w:bottom w:val="single" w:color="CBD5E1" w:sz="4"/>
+              <w:right w:val="single" w:color="CBD5E1" w:sz="4"/>
+            </w:tcBorders>
+            <w:shd w:fill="FFFFFF" w:color="auto" w:val="clear"/>
+            <w:tcMar>
+              <w:top w:type="dxa" w:w="70"/>
+              <w:left w:type="dxa" w:w="110"/>
+              <w:bottom w:type="dxa" w:w="70"/>
+              <w:right w:type="dxa" w:w="110"/>
+            </w:tcMar>
+          </w:tcPr>
+          <w:p>
+            <w:pPr>
+              <w:spacing w:after="0" w:line="264"/>
+            </w:pPr>
+            <w:r>
+              <w:rPr>
+                <w:b w:val="false"/>
+                <w:bCs w:val="false"/>
+                <w:color w:val="0F172A"/>
+                <w:sz w:val="19"/>
+                <w:szCs w:val="19"/>
+              </w:rPr>
+              <w:t xml:space="preserve">Translucent fill + backdrop-filter blur(22px) saturate(170%)</w:t>
+            </w:r>
+          </w:p>
+        </w:tc>
+      </w:tr>
+      <w:tr>
+        <w:trPr>
+          <w:cantSplit/>
+        </w:trPr>
+        <w:tc>
+          <w:tcPr>
+            <w:tcW w:type="dxa" w:w="1700"/>
+            <w:tcBorders>
+              <w:top w:val="single" w:color="CBD5E1" w:sz="4"/>
+              <w:left w:val="single" w:color="CBD5E1" w:sz="4"/>
+              <w:bottom w:val="single" w:color="CBD5E1" w:sz="4"/>
+              <w:right w:val="single" w:color="CBD5E1" w:sz="4"/>
+            </w:tcBorders>
+            <w:shd w:fill="F8FAFC" w:color="auto" w:val="clear"/>
+            <w:tcMar>
+              <w:top w:type="dxa" w:w="70"/>
+              <w:left w:type="dxa" w:w="110"/>
+              <w:bottom w:type="dxa" w:w="70"/>
+              <w:right w:type="dxa" w:w="110"/>
+            </w:tcMar>
+          </w:tcPr>
+          <w:p>
+            <w:pPr>
+              <w:spacing w:after="0" w:line="264"/>
+            </w:pPr>
+            <w:r>
+              <w:rPr>
+                <w:b w:val="false"/>
+                <w:bCs w:val="false"/>
+                <w:color w:val="0F172A"/>
+                <w:sz w:val="19"/>
+                <w:szCs w:val="19"/>
+              </w:rPr>
+              <w:t xml:space="preserve">Hover / focus</w:t>
+            </w:r>
+          </w:p>
+        </w:tc>
+        <w:tc>
+          <w:tcPr>
+            <w:tcW w:type="dxa" w:w="4100"/>
+            <w:tcBorders>
+              <w:top w:val="single" w:color="CBD5E1" w:sz="4"/>
+              <w:left w:val="single" w:color="CBD5E1" w:sz="4"/>
+              <w:bottom w:val="single" w:color="CBD5E1" w:sz="4"/>
+              <w:right w:val="single" w:color="CBD5E1" w:sz="4"/>
+            </w:tcBorders>
+            <w:shd w:fill="F8FAFC" w:color="auto" w:val="clear"/>
+            <w:tcMar>
+              <w:top w:type="dxa" w:w="70"/>
+              <w:left w:type="dxa" w:w="110"/>
+              <w:bottom w:type="dxa" w:w="70"/>
+              <w:right w:type="dxa" w:w="110"/>
+            </w:tcMar>
+          </w:tcPr>
+          <w:p>
+            <w:pPr>
+              <w:spacing w:after="0" w:line="264"/>
+            </w:pPr>
+            <w:r>
+              <w:rPr>
+                <w:b w:val="false"/>
+                <w:bCs w:val="false"/>
+                <w:color w:val="0F172A"/>
+                <w:sz w:val="19"/>
+                <w:szCs w:val="19"/>
+              </w:rPr>
+              <w:t xml:space="preserve">Frost clears so the background shows through; bright blue rim and glow; card lifts 4 px</w:t>
+            </w:r>
+          </w:p>
+        </w:tc>
+        <w:tc>
+          <w:tcPr>
+            <w:tcW w:type="dxa" w:w="3838"/>
+            <w:tcBorders>
+              <w:top w:val="single" w:color="CBD5E1" w:sz="4"/>
+              <w:left w:val="single" w:color="CBD5E1" w:sz="4"/>
+              <w:bottom w:val="single" w:color="CBD5E1" w:sz="4"/>
+              <w:right w:val="single" w:color="CBD5E1" w:sz="4"/>
+            </w:tcBorders>
+            <w:shd w:fill="F8FAFC" w:color="auto" w:val="clear"/>
+            <w:tcMar>
+              <w:top w:type="dxa" w:w="70"/>
+              <w:left w:type="dxa" w:w="110"/>
+              <w:bottom w:type="dxa" w:w="70"/>
+              <w:right w:type="dxa" w:w="110"/>
+            </w:tcMar>
+          </w:tcPr>
+          <w:p>
+            <w:pPr>
+              <w:spacing w:after="0" w:line="264"/>
+            </w:pPr>
+            <w:r>
+              <w:rPr>
+                <w:b w:val="false"/>
+                <w:bCs w:val="false"/>
+                <w:color w:val="0F172A"/>
+                <w:sz w:val="19"/>
+                <w:szCs w:val="19"/>
+              </w:rPr>
+              <w:t xml:space="preserve">Blur eases to 6 px in 0.45 s; inset rim + outer glow; translateY(-4px)</w:t>
+            </w:r>
+          </w:p>
+        </w:tc>
+      </w:tr>
+      <w:tr>
+        <w:trPr>
+          <w:cantSplit/>
+        </w:trPr>
+        <w:tc>
+          <w:tcPr>
+            <w:tcW w:type="dxa" w:w="1700"/>
+            <w:tcBorders>
+              <w:top w:val="single" w:color="CBD5E1" w:sz="4"/>
+              <w:left w:val="single" w:color="CBD5E1" w:sz="4"/>
+              <w:bottom w:val="single" w:color="CBD5E1" w:sz="4"/>
+              <w:right w:val="single" w:color="CBD5E1" w:sz="4"/>
+            </w:tcBorders>
+            <w:shd w:fill="FFFFFF" w:color="auto" w:val="clear"/>
+            <w:tcMar>
+              <w:top w:type="dxa" w:w="70"/>
+              <w:left w:type="dxa" w:w="110"/>
+              <w:bottom w:type="dxa" w:w="70"/>
+              <w:right w:type="dxa" w:w="110"/>
+            </w:tcMar>
+          </w:tcPr>
+          <w:p>
+            <w:pPr>
+              <w:spacing w:after="0" w:line="264"/>
+            </w:pPr>
+            <w:r>
+              <w:rPr>
+                <w:b w:val="false"/>
+                <w:bCs w:val="false"/>
+                <w:color w:val="0F172A"/>
+                <w:sz w:val="19"/>
+                <w:szCs w:val="19"/>
+              </w:rPr>
+              <w:t xml:space="preserve">Press (click)</w:t>
+            </w:r>
+          </w:p>
+        </w:tc>
+        <w:tc>
+          <w:tcPr>
+            <w:tcW w:type="dxa" w:w="4100"/>
+            <w:tcBorders>
+              <w:top w:val="single" w:color="CBD5E1" w:sz="4"/>
+              <w:left w:val="single" w:color="CBD5E1" w:sz="4"/>
+              <w:bottom w:val="single" w:color="CBD5E1" w:sz="4"/>
+              <w:right w:val="single" w:color="CBD5E1" w:sz="4"/>
+            </w:tcBorders>
+            <w:shd w:fill="FFFFFF" w:color="auto" w:val="clear"/>
+            <w:tcMar>
+              <w:top w:type="dxa" w:w="70"/>
+              <w:left w:type="dxa" w:w="110"/>
+              <w:bottom w:type="dxa" w:w="70"/>
+              <w:right w:type="dxa" w:w="110"/>
+            </w:tcMar>
+          </w:tcPr>
+          <w:p>
+            <w:pPr>
+              <w:spacing w:after="0" w:line="264"/>
+            </w:pPr>
+            <w:r>
+              <w:rPr>
+                <w:b w:val="false"/>
+                <w:bCs w:val="false"/>
+                <w:color w:val="0F172A"/>
+                <w:sz w:val="19"/>
+                <w:szCs w:val="19"/>
+              </w:rPr>
+              <w:t xml:space="preserve">Card sinks slightly; a light flash spreads from the click point</w:t>
+            </w:r>
+          </w:p>
+        </w:tc>
+        <w:tc>
+          <w:tcPr>
+            <w:tcW w:type="dxa" w:w="3838"/>
+            <w:tcBorders>
+              <w:top w:val="single" w:color="CBD5E1" w:sz="4"/>
+              <w:left w:val="single" w:color="CBD5E1" w:sz="4"/>
+              <w:bottom w:val="single" w:color="CBD5E1" w:sz="4"/>
+              <w:right w:val="single" w:color="CBD5E1" w:sz="4"/>
+            </w:tcBorders>
+            <w:shd w:fill="FFFFFF" w:color="auto" w:val="clear"/>
+            <w:tcMar>
+              <w:top w:type="dxa" w:w="70"/>
+              <w:left w:type="dxa" w:w="110"/>
+              <w:bottom w:type="dxa" w:w="70"/>
+              <w:right w:type="dxa" w:w="110"/>
+            </w:tcMar>
+          </w:tcPr>
+          <w:p>
+            <w:pPr>
+              <w:spacing w:after="0" w:line="264"/>
+            </w:pPr>
+            <w:r>
+              <w:rPr>
+                <w:b w:val="false"/>
+                <w:bCs w:val="false"/>
+                <w:color w:val="0F172A"/>
+                <w:sz w:val="19"/>
+                <w:szCs w:val="19"/>
+              </w:rPr>
+              <w:t xml:space="preserve">scale(.985) on :active; site.js adds a radial flash that fades in 0.7 s</w:t>
+            </w:r>
+          </w:p>
+        </w:tc>
+      </w:tr>
+      <w:tr>
+        <w:trPr>
+          <w:cantSplit/>
+        </w:trPr>
+        <w:tc>
+          <w:tcPr>
+            <w:tcW w:type="dxa" w:w="1700"/>
+            <w:tcBorders>
+              <w:top w:val="single" w:color="CBD5E1" w:sz="4"/>
+              <w:left w:val="single" w:color="CBD5E1" w:sz="4"/>
+              <w:bottom w:val="single" w:color="CBD5E1" w:sz="4"/>
+              <w:right w:val="single" w:color="CBD5E1" w:sz="4"/>
+            </w:tcBorders>
+            <w:shd w:fill="F8FAFC" w:color="auto" w:val="clear"/>
+            <w:tcMar>
+              <w:top w:type="dxa" w:w="70"/>
+              <w:left w:type="dxa" w:w="110"/>
+              <w:bottom w:type="dxa" w:w="70"/>
+              <w:right w:type="dxa" w:w="110"/>
+            </w:tcMar>
+          </w:tcPr>
+          <w:p>
+            <w:pPr>
+              <w:spacing w:after="0" w:line="264"/>
+            </w:pPr>
+            <w:r>
+              <w:rPr>
+                <w:b w:val="false"/>
+                <w:bCs w:val="false"/>
+                <w:color w:val="0F172A"/>
+                <w:sz w:val="19"/>
+                <w:szCs w:val="19"/>
+              </w:rPr>
+              <w:t xml:space="preserve">Current page</w:t>
+            </w:r>
+          </w:p>
+        </w:tc>
+        <w:tc>
+          <w:tcPr>
+            <w:tcW w:type="dxa" w:w="4100"/>
+            <w:tcBorders>
+              <w:top w:val="single" w:color="CBD5E1" w:sz="4"/>
+              <w:left w:val="single" w:color="CBD5E1" w:sz="4"/>
+              <w:bottom w:val="single" w:color="CBD5E1" w:sz="4"/>
+              <w:right w:val="single" w:color="CBD5E1" w:sz="4"/>
+            </w:tcBorders>
+            <w:shd w:fill="F8FAFC" w:color="auto" w:val="clear"/>
+            <w:tcMar>
+              <w:top w:type="dxa" w:w="70"/>
+              <w:left w:type="dxa" w:w="110"/>
+              <w:bottom w:type="dxa" w:w="70"/>
+              <w:right w:type="dxa" w:w="110"/>
+            </w:tcMar>
+          </w:tcPr>
+          <w:p>
+            <w:pPr>
+              <w:spacing w:after="0" w:line="264"/>
+            </w:pPr>
+            <w:r>
+              <w:rPr>
+                <w:b w:val="false"/>
+                <w:bCs w:val="false"/>
+                <w:color w:val="0F172A"/>
+                <w:sz w:val="19"/>
+                <w:szCs w:val="19"/>
+              </w:rPr>
+              <w:t xml:space="preserve">Active menu item shown as a small clear-glass button</w:t>
+            </w:r>
+          </w:p>
+        </w:tc>
+        <w:tc>
+          <w:tcPr>
+            <w:tcW w:type="dxa" w:w="3838"/>
+            <w:tcBorders>
+              <w:top w:val="single" w:color="CBD5E1" w:sz="4"/>
+              <w:left w:val="single" w:color="CBD5E1" w:sz="4"/>
+              <w:bottom w:val="single" w:color="CBD5E1" w:sz="4"/>
+              <w:right w:val="single" w:color="CBD5E1" w:sz="4"/>
+            </w:tcBorders>
+            <w:shd w:fill="F8FAFC" w:color="auto" w:val="clear"/>
+            <w:tcMar>
+              <w:top w:type="dxa" w:w="70"/>
+              <w:left w:type="dxa" w:w="110"/>
+              <w:bottom w:type="dxa" w:w="70"/>
+              <w:right w:type="dxa" w:w="110"/>
+            </w:tcMar>
+          </w:tcPr>
+          <w:p>
+            <w:pPr>
+              <w:spacing w:after="0" w:line="264"/>
+            </w:pPr>
+            <w:r>
+              <w:rPr>
+                <w:b w:val="false"/>
+                <w:bCs w:val="false"/>
+                <w:color w:val="0F172A"/>
+                <w:sz w:val="19"/>
+                <w:szCs w:val="19"/>
+              </w:rPr>
+              <w:t xml:space="preserve">Glass gradient + inset highlight on .nav-link.is-active</w:t>
+            </w:r>
+          </w:p>
+        </w:tc>
+      </w:tr>
+      <w:tr>
+        <w:trPr>
+          <w:cantSplit/>
+        </w:trPr>
+        <w:tc>
+          <w:tcPr>
+            <w:tcW w:type="dxa" w:w="1700"/>
+            <w:tcBorders>
+              <w:top w:val="single" w:color="CBD5E1" w:sz="4"/>
+              <w:left w:val="single" w:color="CBD5E1" w:sz="4"/>
+              <w:bottom w:val="single" w:color="CBD5E1" w:sz="4"/>
+              <w:right w:val="single" w:color="CBD5E1" w:sz="4"/>
+            </w:tcBorders>
+            <w:shd w:fill="FFFFFF" w:color="auto" w:val="clear"/>
+            <w:tcMar>
+              <w:top w:type="dxa" w:w="70"/>
+              <w:left w:type="dxa" w:w="110"/>
+              <w:bottom w:type="dxa" w:w="70"/>
+              <w:right w:type="dxa" w:w="110"/>
+            </w:tcMar>
+          </w:tcPr>
+          <w:p>
+            <w:pPr>
+              <w:spacing w:after="0" w:line="264"/>
+            </w:pPr>
+            <w:r>
+              <w:rPr>
+                <w:b w:val="false"/>
+                <w:bCs w:val="false"/>
+                <w:color w:val="0F172A"/>
+                <w:sz w:val="19"/>
+                <w:szCs w:val="19"/>
+              </w:rPr>
+              <w:t xml:space="preserve">Table row</w:t>
+            </w:r>
+          </w:p>
+        </w:tc>
+        <w:tc>
+          <w:tcPr>
+            <w:tcW w:type="dxa" w:w="4100"/>
+            <w:tcBorders>
+              <w:top w:val="single" w:color="CBD5E1" w:sz="4"/>
+              <w:left w:val="single" w:color="CBD5E1" w:sz="4"/>
+              <w:bottom w:val="single" w:color="CBD5E1" w:sz="4"/>
+              <w:right w:val="single" w:color="CBD5E1" w:sz="4"/>
+            </w:tcBorders>
+            <w:shd w:fill="FFFFFF" w:color="auto" w:val="clear"/>
+            <w:tcMar>
+              <w:top w:type="dxa" w:w="70"/>
+              <w:left w:type="dxa" w:w="110"/>
+              <w:bottom w:type="dxa" w:w="70"/>
+              <w:right w:type="dxa" w:w="110"/>
+            </w:tcMar>
+          </w:tcPr>
+          <w:p>
+            <w:pPr>
+              <w:spacing w:after="0" w:line="264"/>
+            </w:pPr>
+            <w:r>
+              <w:rPr>
+                <w:b w:val="false"/>
+                <w:bCs w:val="false"/>
+                <w:color w:val="0F172A"/>
+                <w:sz w:val="19"/>
+                <w:szCs w:val="19"/>
+              </w:rPr>
+              <w:t xml:space="preserve">Light glass highlight with a blue left edge</w:t>
+            </w:r>
+          </w:p>
+        </w:tc>
+        <w:tc>
+          <w:tcPr>
+            <w:tcW w:type="dxa" w:w="3838"/>
+            <w:tcBorders>
+              <w:top w:val="single" w:color="CBD5E1" w:sz="4"/>
+              <w:left w:val="single" w:color="CBD5E1" w:sz="4"/>
+              <w:bottom w:val="single" w:color="CBD5E1" w:sz="4"/>
+              <w:right w:val="single" w:color="CBD5E1" w:sz="4"/>
+            </w:tcBorders>
+            <w:shd w:fill="FFFFFF" w:color="auto" w:val="clear"/>
+            <w:tcMar>
+              <w:top w:type="dxa" w:w="70"/>
+              <w:left w:type="dxa" w:w="110"/>
+              <w:bottom w:type="dxa" w:w="70"/>
+              <w:right w:type="dxa" w:w="110"/>
+            </w:tcMar>
+          </w:tcPr>
+          <w:p>
+            <w:pPr>
+              <w:spacing w:after="0" w:line="264"/>
+            </w:pPr>
+            <w:r>
+              <w:rPr>
+                <w:b w:val="false"/>
+                <w:bCs w:val="false"/>
+                <w:color w:val="0F172A"/>
+                <w:sz w:val="19"/>
+                <w:szCs w:val="19"/>
+              </w:rPr>
+              <w:t xml:space="preserve">Gradient background + inset 2 px accent line</w:t>
+            </w:r>
+          </w:p>
+        </w:tc>
+      </w:tr>
+      <w:tr>
+        <w:trPr>
+          <w:cantSplit/>
+        </w:trPr>
+        <w:tc>
+          <w:tcPr>
+            <w:tcW w:type="dxa" w:w="1700"/>
+            <w:tcBorders>
+              <w:top w:val="single" w:color="CBD5E1" w:sz="4"/>
+              <w:left w:val="single" w:color="CBD5E1" w:sz="4"/>
+              <w:bottom w:val="single" w:color="CBD5E1" w:sz="4"/>
+              <w:right w:val="single" w:color="CBD5E1" w:sz="4"/>
+            </w:tcBorders>
+            <w:shd w:fill="F8FAFC" w:color="auto" w:val="clear"/>
+            <w:tcMar>
+              <w:top w:type="dxa" w:w="70"/>
+              <w:left w:type="dxa" w:w="110"/>
+              <w:bottom w:type="dxa" w:w="70"/>
+              <w:right w:type="dxa" w:w="110"/>
+            </w:tcMar>
+          </w:tcPr>
+          <w:p>
+            <w:pPr>
+              <w:spacing w:after="0" w:line="264"/>
+            </w:pPr>
+            <w:r>
+              <w:rPr>
+                <w:b w:val="false"/>
+                <w:bCs w:val="false"/>
+                <w:color w:val="0F172A"/>
+                <w:sz w:val="19"/>
+                <w:szCs w:val="19"/>
+              </w:rPr>
+              <w:t xml:space="preserve">No blur support</w:t>
+            </w:r>
+          </w:p>
+        </w:tc>
+        <w:tc>
+          <w:tcPr>
+            <w:tcW w:type="dxa" w:w="4100"/>
+            <w:tcBorders>
+              <w:top w:val="single" w:color="CBD5E1" w:sz="4"/>
+              <w:left w:val="single" w:color="CBD5E1" w:sz="4"/>
+              <w:bottom w:val="single" w:color="CBD5E1" w:sz="4"/>
+              <w:right w:val="single" w:color="CBD5E1" w:sz="4"/>
+            </w:tcBorders>
+            <w:shd w:fill="F8FAFC" w:color="auto" w:val="clear"/>
+            <w:tcMar>
+              <w:top w:type="dxa" w:w="70"/>
+              <w:left w:type="dxa" w:w="110"/>
+              <w:bottom w:type="dxa" w:w="70"/>
+              <w:right w:type="dxa" w:w="110"/>
+            </w:tcMar>
+          </w:tcPr>
+          <w:p>
+            <w:pPr>
+              <w:spacing w:after="0" w:line="264"/>
+            </w:pPr>
+            <w:r>
+              <w:rPr>
+                <w:b w:val="false"/>
+                <w:bCs w:val="false"/>
+                <w:color w:val="0F172A"/>
+                <w:sz w:val="19"/>
+                <w:szCs w:val="19"/>
+              </w:rPr>
+              <w:t xml:space="preserve">Solid dark panels, text stays readable</w:t>
+            </w:r>
+          </w:p>
+        </w:tc>
+        <w:tc>
+          <w:tcPr>
+            <w:tcW w:type="dxa" w:w="3838"/>
+            <w:tcBorders>
+              <w:top w:val="single" w:color="CBD5E1" w:sz="4"/>
+              <w:left w:val="single" w:color="CBD5E1" w:sz="4"/>
+              <w:bottom w:val="single" w:color="CBD5E1" w:sz="4"/>
+              <w:right w:val="single" w:color="CBD5E1" w:sz="4"/>
+            </w:tcBorders>
+            <w:shd w:fill="F8FAFC" w:color="auto" w:val="clear"/>
+            <w:tcMar>
+              <w:top w:type="dxa" w:w="70"/>
+              <w:left w:type="dxa" w:w="110"/>
+              <w:bottom w:type="dxa" w:w="70"/>
+              <w:right w:type="dxa" w:w="110"/>
+            </w:tcMar>
+          </w:tcPr>
+          <w:p>
+            <w:pPr>
+              <w:spacing w:after="0" w:line="264"/>
+            </w:pPr>
+            <w:r>
+              <w:rPr>
+                <w:b w:val="false"/>
+                <w:bCs w:val="false"/>
+                <w:color w:val="0F172A"/>
+                <w:sz w:val="19"/>
+                <w:szCs w:val="19"/>
+              </w:rPr>
+              <w:t xml:space="preserve">@supports fallback to an opaque surface</w:t>
+            </w:r>
+          </w:p>
+        </w:tc>
+      </w:tr>
+    </w:tbl>
     <w:p>
       <w:pPr>
         <w:pStyle w:val="Heading1"/>
@@ -12441,6 +13202,69 @@
     </w:p>
     <w:p>
       <w:pPr>
+        <w:keepNext/>
+        <w:spacing w:after="60" w:before="120"/>
+        <w:jc w:val="center"/>
+      </w:pPr>
+      <w:r>
+        <w:drawing>
+          <wp:inline distT="0" distB="0" distL="0" distR="0">
+            <wp:extent cx="5715000" cy="3571875"/>
+            <wp:effectExtent t="0" r="0" b="0" l="0"/>
+            <wp:docPr id="23" name="ui-glass-hover.jpg" descr="ui glass hover jpg" title="ui-glass-hover.jpg"/>
+            <wp:cNvGraphicFramePr>
+              <a:graphicFrameLocks xmlns:a="http://schemas.openxmlformats.org/drawingml/2006/main" noChangeAspect="1"/>
+            </wp:cNvGraphicFramePr>
+            <a:graphic xmlns:a="http://schemas.openxmlformats.org/drawingml/2006/main">
+              <a:graphicData uri="http://schemas.openxmlformats.org/drawingml/2006/picture">
+                <pic:pic xmlns:pic="http://schemas.openxmlformats.org/drawingml/2006/picture">
+                  <pic:nvPicPr>
+                    <pic:cNvPr id="0" name="" descr=""/>
+                    <pic:cNvPicPr>
+                      <a:picLocks noChangeAspect="1" noChangeArrowheads="1"/>
+                    </pic:cNvPicPr>
+                  </pic:nvPicPr>
+                  <pic:blipFill>
+                    <a:blip r:embed="rId30" cstate="none"/>
+                    <a:srcRect/>
+                    <a:stretch>
+                      <a:fillRect/>
+                    </a:stretch>
+                  </pic:blipFill>
+                  <pic:spPr bwMode="auto">
+                    <a:xfrm>
+                      <a:off x="0" y="0"/>
+                      <a:ext cx="5715000" cy="3571875"/>
+                    </a:xfrm>
+                    <a:prstGeom prst="rect">
+                      <a:avLst/>
+                    </a:prstGeom>
+                  </pic:spPr>
+                </pic:pic>
+              </a:graphicData>
+            </a:graphic>
+          </wp:inline>
+        </w:drawing>
+      </w:r>
+    </w:p>
+    <w:p>
+      <w:pPr>
+        <w:spacing w:after="240" w:before="60"/>
+        <w:jc w:val="center"/>
+      </w:pPr>
+      <w:r>
+        <w:rPr>
+          <w:i/>
+          <w:iCs/>
+          <w:color w:val="475569"/>
+          <w:sz w:val="18"/>
+          <w:szCs w:val="18"/>
+        </w:rPr>
+        <w:t xml:space="preserve">Figure 22 - Clear-glass hover - the hovered plan card turns clear with a lit rim</w:t>
+      </w:r>
+    </w:p>
+    <w:p>
+      <w:pPr>
         <w:pStyle w:val="Heading1"/>
         <w:pageBreakBefore/>
       </w:pPr>

</xml_diff>

<commit_message>
Documentation: ADSE Semester 3, Aptech Center NN2, system role per team member
Co-Authored-By: Claude Opus 5.5 <noreply@anthropic.com>
Claude-Session: https://claude.ai/code/session_01EGrnzrfHztmX7RAaosfXYG
</commit_message>
<xml_diff>
--- a/documentation/Nexus_Documentation/Nexus_Project_Report.docx
+++ b/documentation/Nexus_Documentation/Nexus_Project_Report.docx
@@ -356,6 +356,148 @@
                 <w:sz w:val="19"/>
                 <w:szCs w:val="19"/>
               </w:rPr>
+              <w:t xml:space="preserve">Curriculum / Semester</w:t>
+            </w:r>
+          </w:p>
+        </w:tc>
+        <w:tc>
+          <w:tcPr>
+            <w:tcW w:type="dxa" w:w="7038"/>
+            <w:tcBorders>
+              <w:top w:val="single" w:color="CBD5E1" w:sz="4"/>
+              <w:left w:val="single" w:color="CBD5E1" w:sz="4"/>
+              <w:bottom w:val="single" w:color="CBD5E1" w:sz="4"/>
+              <w:right w:val="single" w:color="CBD5E1" w:sz="4"/>
+            </w:tcBorders>
+            <w:shd w:fill="FFFFFF" w:color="auto" w:val="clear"/>
+            <w:tcMar>
+              <w:top w:type="dxa" w:w="70"/>
+              <w:left w:type="dxa" w:w="110"/>
+              <w:bottom w:type="dxa" w:w="70"/>
+              <w:right w:type="dxa" w:w="110"/>
+            </w:tcMar>
+          </w:tcPr>
+          <w:p>
+            <w:pPr>
+              <w:spacing w:after="0" w:line="264"/>
+            </w:pPr>
+            <w:r>
+              <w:rPr>
+                <w:b w:val="false"/>
+                <w:bCs w:val="false"/>
+                <w:color w:val="0F172A"/>
+                <w:sz w:val="19"/>
+                <w:szCs w:val="19"/>
+              </w:rPr>
+              <w:t xml:space="preserve">ADSE - Semester 3</w:t>
+            </w:r>
+          </w:p>
+        </w:tc>
+      </w:tr>
+      <w:tr>
+        <w:trPr>
+          <w:cantSplit/>
+        </w:trPr>
+        <w:tc>
+          <w:tcPr>
+            <w:tcW w:type="dxa" w:w="2600"/>
+            <w:tcBorders>
+              <w:top w:val="single" w:color="CBD5E1" w:sz="4"/>
+              <w:left w:val="single" w:color="CBD5E1" w:sz="4"/>
+              <w:bottom w:val="single" w:color="CBD5E1" w:sz="4"/>
+              <w:right w:val="single" w:color="CBD5E1" w:sz="4"/>
+            </w:tcBorders>
+            <w:shd w:fill="F8FAFC" w:color="auto" w:val="clear"/>
+            <w:tcMar>
+              <w:top w:type="dxa" w:w="70"/>
+              <w:left w:type="dxa" w:w="110"/>
+              <w:bottom w:type="dxa" w:w="70"/>
+              <w:right w:type="dxa" w:w="110"/>
+            </w:tcMar>
+          </w:tcPr>
+          <w:p>
+            <w:pPr>
+              <w:spacing w:after="0" w:line="264"/>
+            </w:pPr>
+            <w:r>
+              <w:rPr>
+                <w:b w:val="false"/>
+                <w:bCs w:val="false"/>
+                <w:color w:val="0F172A"/>
+                <w:sz w:val="19"/>
+                <w:szCs w:val="19"/>
+              </w:rPr>
+              <w:t xml:space="preserve">Centre</w:t>
+            </w:r>
+          </w:p>
+        </w:tc>
+        <w:tc>
+          <w:tcPr>
+            <w:tcW w:type="dxa" w:w="7038"/>
+            <w:tcBorders>
+              <w:top w:val="single" w:color="CBD5E1" w:sz="4"/>
+              <w:left w:val="single" w:color="CBD5E1" w:sz="4"/>
+              <w:bottom w:val="single" w:color="CBD5E1" w:sz="4"/>
+              <w:right w:val="single" w:color="CBD5E1" w:sz="4"/>
+            </w:tcBorders>
+            <w:shd w:fill="F8FAFC" w:color="auto" w:val="clear"/>
+            <w:tcMar>
+              <w:top w:type="dxa" w:w="70"/>
+              <w:left w:type="dxa" w:w="110"/>
+              <w:bottom w:type="dxa" w:w="70"/>
+              <w:right w:type="dxa" w:w="110"/>
+            </w:tcMar>
+          </w:tcPr>
+          <w:p>
+            <w:pPr>
+              <w:spacing w:after="0" w:line="264"/>
+            </w:pPr>
+            <w:r>
+              <w:rPr>
+                <w:b w:val="false"/>
+                <w:bCs w:val="false"/>
+                <w:color w:val="0F172A"/>
+                <w:sz w:val="19"/>
+                <w:szCs w:val="19"/>
+              </w:rPr>
+              <w:t xml:space="preserve">Aptech Center NN2</w:t>
+            </w:r>
+          </w:p>
+        </w:tc>
+      </w:tr>
+      <w:tr>
+        <w:trPr>
+          <w:cantSplit/>
+        </w:trPr>
+        <w:tc>
+          <w:tcPr>
+            <w:tcW w:type="dxa" w:w="2600"/>
+            <w:tcBorders>
+              <w:top w:val="single" w:color="CBD5E1" w:sz="4"/>
+              <w:left w:val="single" w:color="CBD5E1" w:sz="4"/>
+              <w:bottom w:val="single" w:color="CBD5E1" w:sz="4"/>
+              <w:right w:val="single" w:color="CBD5E1" w:sz="4"/>
+            </w:tcBorders>
+            <w:shd w:fill="FFFFFF" w:color="auto" w:val="clear"/>
+            <w:tcMar>
+              <w:top w:type="dxa" w:w="70"/>
+              <w:left w:type="dxa" w:w="110"/>
+              <w:bottom w:type="dxa" w:w="70"/>
+              <w:right w:type="dxa" w:w="110"/>
+            </w:tcMar>
+          </w:tcPr>
+          <w:p>
+            <w:pPr>
+              <w:spacing w:after="0" w:line="264"/>
+            </w:pPr>
+            <w:r>
+              <w:rPr>
+                <w:b w:val="false"/>
+                <w:bCs w:val="false"/>
+                <w:color w:val="0F172A"/>
+                <w:sz w:val="19"/>
+                <w:szCs w:val="19"/>
+              </w:rPr>
               <w:t xml:space="preserve">Project type</w:t>
             </w:r>
           </w:p>
@@ -1997,7 +2139,7 @@
         <w:spacing w:after="120" w:line="288"/>
       </w:pPr>
       <w:r>
-        <w:t xml:space="preserve">Nexus Service Marketing System was built by a team of 5 students. Every member took part in analysis, testing and the final review; the table shows each member's main area.</w:t>
+        <w:t xml:space="preserve">Nexus Service Marketing System was built by a team of 5 students of ADSE Semester 3, Aptech Center NN2. Every member took part in analysis, testing and the final review; the table shows each member's main area.</w:t>
       </w:r>
     </w:p>
     <w:tbl>
@@ -2828,6 +2970,1052 @@
                 <w:szCs w:val="19"/>
               </w:rPr>
               <w:t xml:space="preserve">Interface design, customer documents, testing and documentation</w:t>
+            </w:r>
+          </w:p>
+        </w:tc>
+      </w:tr>
+    </w:tbl>
+    <w:p>
+      <w:pPr>
+        <w:pStyle w:val="Heading2"/>
+      </w:pPr>
+      <w:r>
+        <w:t xml:space="preserve">System roles</w:t>
+      </w:r>
+    </w:p>
+    <w:p>
+      <w:pPr>
+        <w:spacing w:after="120" w:line="288"/>
+      </w:pPr>
+      <w:r>
+        <w:t xml:space="preserve">The system has five user roles and the team has five members, so each member owns one role: they demonstrate it in the live demo and answer questions about it.</w:t>
+      </w:r>
+    </w:p>
+    <w:tbl>
+      <w:tblPr>
+        <w:tblW w:type="dxa" w:w="9638"/>
+        <w:tblBorders>
+          <w:top w:val="single" w:color="auto" w:sz="4"/>
+          <w:left w:val="single" w:color="auto" w:sz="4"/>
+          <w:bottom w:val="single" w:color="auto" w:sz="4"/>
+          <w:right w:val="single" w:color="auto" w:sz="4"/>
+          <w:insideH w:val="single" w:color="auto" w:sz="4"/>
+          <w:insideV w:val="single" w:color="auto" w:sz="4"/>
+        </w:tblBorders>
+      </w:tblPr>
+      <w:tblGrid>
+        <w:gridCol w:w="2100"/>
+        <w:gridCol w:w="1500"/>
+        <w:gridCol w:w="1500"/>
+        <w:gridCol w:w="2700"/>
+        <w:gridCol w:w="1838"/>
+      </w:tblGrid>
+      <w:tr>
+        <w:trPr>
+          <w:tblHeader/>
+        </w:trPr>
+        <w:tc>
+          <w:tcPr>
+            <w:tcW w:type="dxa" w:w="2100"/>
+            <w:tcBorders>
+              <w:top w:val="single" w:color="CBD5E1" w:sz="4"/>
+              <w:left w:val="single" w:color="CBD5E1" w:sz="4"/>
+              <w:bottom w:val="single" w:color="CBD5E1" w:sz="4"/>
+              <w:right w:val="single" w:color="CBD5E1" w:sz="4"/>
+            </w:tcBorders>
+            <w:shd w:fill="0A2540" w:color="auto" w:val="clear"/>
+            <w:tcMar>
+              <w:top w:type="dxa" w:w="80"/>
+              <w:left w:type="dxa" w:w="110"/>
+              <w:bottom w:type="dxa" w:w="80"/>
+              <w:right w:type="dxa" w:w="110"/>
+            </w:tcMar>
+            <w:vAlign w:val="center"/>
+          </w:tcPr>
+          <w:p>
+            <w:r>
+              <w:rPr>
+                <w:b/>
+                <w:bCs/>
+                <w:color w:val="FFFFFF"/>
+                <w:sz w:val="19"/>
+                <w:szCs w:val="19"/>
+              </w:rPr>
+              <w:t xml:space="preserve">Member</w:t>
+            </w:r>
+          </w:p>
+        </w:tc>
+        <w:tc>
+          <w:tcPr>
+            <w:tcW w:type="dxa" w:w="1500"/>
+            <w:tcBorders>
+              <w:top w:val="single" w:color="CBD5E1" w:sz="4"/>
+              <w:left w:val="single" w:color="CBD5E1" w:sz="4"/>
+              <w:bottom w:val="single" w:color="CBD5E1" w:sz="4"/>
+              <w:right w:val="single" w:color="CBD5E1" w:sz="4"/>
+            </w:tcBorders>
+            <w:shd w:fill="0A2540" w:color="auto" w:val="clear"/>
+            <w:tcMar>
+              <w:top w:type="dxa" w:w="80"/>
+              <w:left w:type="dxa" w:w="110"/>
+              <w:bottom w:type="dxa" w:w="80"/>
+              <w:right w:type="dxa" w:w="110"/>
+            </w:tcMar>
+            <w:vAlign w:val="center"/>
+          </w:tcPr>
+          <w:p>
+            <w:r>
+              <w:rPr>
+                <w:b/>
+                <w:bCs/>
+                <w:color w:val="FFFFFF"/>
+                <w:sz w:val="19"/>
+                <w:szCs w:val="19"/>
+              </w:rPr>
+              <w:t xml:space="preserve">System role</w:t>
+            </w:r>
+          </w:p>
+        </w:tc>
+        <w:tc>
+          <w:tcPr>
+            <w:tcW w:type="dxa" w:w="1500"/>
+            <w:tcBorders>
+              <w:top w:val="single" w:color="CBD5E1" w:sz="4"/>
+              <w:left w:val="single" w:color="CBD5E1" w:sz="4"/>
+              <w:bottom w:val="single" w:color="CBD5E1" w:sz="4"/>
+              <w:right w:val="single" w:color="CBD5E1" w:sz="4"/>
+            </w:tcBorders>
+            <w:shd w:fill="0A2540" w:color="auto" w:val="clear"/>
+            <w:tcMar>
+              <w:top w:type="dxa" w:w="80"/>
+              <w:left w:type="dxa" w:w="110"/>
+              <w:bottom w:type="dxa" w:w="80"/>
+              <w:right w:type="dxa" w:w="110"/>
+            </w:tcMar>
+            <w:vAlign w:val="center"/>
+          </w:tcPr>
+          <w:p>
+            <w:r>
+              <w:rPr>
+                <w:b/>
+                <w:bCs/>
+                <w:color w:val="FFFFFF"/>
+                <w:sz w:val="19"/>
+                <w:szCs w:val="19"/>
+              </w:rPr>
+              <w:t xml:space="preserve">Login used in the demo</w:t>
+            </w:r>
+          </w:p>
+        </w:tc>
+        <w:tc>
+          <w:tcPr>
+            <w:tcW w:type="dxa" w:w="2700"/>
+            <w:tcBorders>
+              <w:top w:val="single" w:color="CBD5E1" w:sz="4"/>
+              <w:left w:val="single" w:color="CBD5E1" w:sz="4"/>
+              <w:bottom w:val="single" w:color="CBD5E1" w:sz="4"/>
+              <w:right w:val="single" w:color="CBD5E1" w:sz="4"/>
+            </w:tcBorders>
+            <w:shd w:fill="0A2540" w:color="auto" w:val="clear"/>
+            <w:tcMar>
+              <w:top w:type="dxa" w:w="80"/>
+              <w:left w:type="dxa" w:w="110"/>
+              <w:bottom w:type="dxa" w:w="80"/>
+              <w:right w:type="dxa" w:w="110"/>
+            </w:tcMar>
+            <w:vAlign w:val="center"/>
+          </w:tcPr>
+          <w:p>
+            <w:r>
+              <w:rPr>
+                <w:b/>
+                <w:bCs/>
+                <w:color w:val="FFFFFF"/>
+                <w:sz w:val="19"/>
+                <w:szCs w:val="19"/>
+              </w:rPr>
+              <w:t xml:space="preserve">Shows in the demo</w:t>
+            </w:r>
+          </w:p>
+        </w:tc>
+        <w:tc>
+          <w:tcPr>
+            <w:tcW w:type="dxa" w:w="1838"/>
+            <w:tcBorders>
+              <w:top w:val="single" w:color="CBD5E1" w:sz="4"/>
+              <w:left w:val="single" w:color="CBD5E1" w:sz="4"/>
+              <w:bottom w:val="single" w:color="CBD5E1" w:sz="4"/>
+              <w:right w:val="single" w:color="CBD5E1" w:sz="4"/>
+            </w:tcBorders>
+            <w:shd w:fill="0A2540" w:color="auto" w:val="clear"/>
+            <w:tcMar>
+              <w:top w:type="dxa" w:w="80"/>
+              <w:left w:type="dxa" w:w="110"/>
+              <w:bottom w:type="dxa" w:w="80"/>
+              <w:right w:type="dxa" w:w="110"/>
+            </w:tcMar>
+            <w:vAlign w:val="center"/>
+          </w:tcPr>
+          <w:p>
+            <w:r>
+              <w:rPr>
+                <w:b/>
+                <w:bCs/>
+                <w:color w:val="FFFFFF"/>
+                <w:sz w:val="19"/>
+                <w:szCs w:val="19"/>
+              </w:rPr>
+              <w:t xml:space="preserve">Presentation</w:t>
+            </w:r>
+          </w:p>
+        </w:tc>
+      </w:tr>
+      <w:tr>
+        <w:trPr>
+          <w:cantSplit/>
+        </w:trPr>
+        <w:tc>
+          <w:tcPr>
+            <w:tcW w:type="dxa" w:w="2100"/>
+            <w:tcBorders>
+              <w:top w:val="single" w:color="CBD5E1" w:sz="4"/>
+              <w:left w:val="single" w:color="CBD5E1" w:sz="4"/>
+              <w:bottom w:val="single" w:color="CBD5E1" w:sz="4"/>
+              <w:right w:val="single" w:color="CBD5E1" w:sz="4"/>
+            </w:tcBorders>
+            <w:shd w:fill="FFFFFF" w:color="auto" w:val="clear"/>
+            <w:tcMar>
+              <w:top w:type="dxa" w:w="70"/>
+              <w:left w:type="dxa" w:w="110"/>
+              <w:bottom w:type="dxa" w:w="70"/>
+              <w:right w:type="dxa" w:w="110"/>
+            </w:tcMar>
+          </w:tcPr>
+          <w:p>
+            <w:pPr>
+              <w:spacing w:after="0" w:line="264"/>
+            </w:pPr>
+            <w:r>
+              <w:rPr>
+                <w:b/>
+                <w:bCs/>
+                <w:color w:val="0F172A"/>
+                <w:sz w:val="19"/>
+                <w:szCs w:val="19"/>
+              </w:rPr>
+              <w:t xml:space="preserve">Ali Jan</w:t>
+            </w:r>
+          </w:p>
+        </w:tc>
+        <w:tc>
+          <w:tcPr>
+            <w:tcW w:type="dxa" w:w="1500"/>
+            <w:tcBorders>
+              <w:top w:val="single" w:color="CBD5E1" w:sz="4"/>
+              <w:left w:val="single" w:color="CBD5E1" w:sz="4"/>
+              <w:bottom w:val="single" w:color="CBD5E1" w:sz="4"/>
+              <w:right w:val="single" w:color="CBD5E1" w:sz="4"/>
+            </w:tcBorders>
+            <w:shd w:fill="FFFFFF" w:color="auto" w:val="clear"/>
+            <w:tcMar>
+              <w:top w:type="dxa" w:w="70"/>
+              <w:left w:type="dxa" w:w="110"/>
+              <w:bottom w:type="dxa" w:w="70"/>
+              <w:right w:type="dxa" w:w="110"/>
+            </w:tcMar>
+          </w:tcPr>
+          <w:p>
+            <w:pPr>
+              <w:spacing w:after="0" w:line="264"/>
+            </w:pPr>
+            <w:r>
+              <w:rPr>
+                <w:b/>
+                <w:bCs/>
+                <w:color w:val="0369A1"/>
+                <w:sz w:val="19"/>
+                <w:szCs w:val="19"/>
+              </w:rPr>
+              <w:t xml:space="preserve">Admin</w:t>
+            </w:r>
+          </w:p>
+        </w:tc>
+        <w:tc>
+          <w:tcPr>
+            <w:tcW w:type="dxa" w:w="1500"/>
+            <w:tcBorders>
+              <w:top w:val="single" w:color="CBD5E1" w:sz="4"/>
+              <w:left w:val="single" w:color="CBD5E1" w:sz="4"/>
+              <w:bottom w:val="single" w:color="CBD5E1" w:sz="4"/>
+              <w:right w:val="single" w:color="CBD5E1" w:sz="4"/>
+            </w:tcBorders>
+            <w:shd w:fill="FFFFFF" w:color="auto" w:val="clear"/>
+            <w:tcMar>
+              <w:top w:type="dxa" w:w="70"/>
+              <w:left w:type="dxa" w:w="110"/>
+              <w:bottom w:type="dxa" w:w="70"/>
+              <w:right w:type="dxa" w:w="110"/>
+            </w:tcMar>
+          </w:tcPr>
+          <w:p>
+            <w:pPr>
+              <w:spacing w:after="0" w:line="264"/>
+            </w:pPr>
+            <w:r>
+              <w:rPr>
+                <w:b w:val="false"/>
+                <w:bCs w:val="false"/>
+                <w:color w:val="0F172A"/>
+                <w:sz w:val="19"/>
+                <w:szCs w:val="19"/>
+              </w:rPr>
+              <w:t xml:space="preserve">admin</w:t>
+            </w:r>
+          </w:p>
+        </w:tc>
+        <w:tc>
+          <w:tcPr>
+            <w:tcW w:type="dxa" w:w="2700"/>
+            <w:tcBorders>
+              <w:top w:val="single" w:color="CBD5E1" w:sz="4"/>
+              <w:left w:val="single" w:color="CBD5E1" w:sz="4"/>
+              <w:bottom w:val="single" w:color="CBD5E1" w:sz="4"/>
+              <w:right w:val="single" w:color="CBD5E1" w:sz="4"/>
+            </w:tcBorders>
+            <w:shd w:fill="FFFFFF" w:color="auto" w:val="clear"/>
+            <w:tcMar>
+              <w:top w:type="dxa" w:w="70"/>
+              <w:left w:type="dxa" w:w="110"/>
+              <w:bottom w:type="dxa" w:w="70"/>
+              <w:right w:type="dxa" w:w="110"/>
+            </w:tcMar>
+          </w:tcPr>
+          <w:p>
+            <w:pPr>
+              <w:spacing w:after="0" w:line="264"/>
+            </w:pPr>
+            <w:r>
+              <w:rPr>
+                <w:b w:val="false"/>
+                <w:bCs w:val="false"/>
+                <w:color w:val="0F172A"/>
+                <w:sz w:val="19"/>
+                <w:szCs w:val="19"/>
+              </w:rPr>
+              <w:t xml:space="preserve">Dashboard, cities, employees, plans, reports</w:t>
+            </w:r>
+          </w:p>
+        </w:tc>
+        <w:tc>
+          <w:tcPr>
+            <w:tcW w:type="dxa" w:w="1838"/>
+            <w:tcBorders>
+              <w:top w:val="single" w:color="CBD5E1" w:sz="4"/>
+              <w:left w:val="single" w:color="CBD5E1" w:sz="4"/>
+              <w:bottom w:val="single" w:color="CBD5E1" w:sz="4"/>
+              <w:right w:val="single" w:color="CBD5E1" w:sz="4"/>
+            </w:tcBorders>
+            <w:shd w:fill="FFFFFF" w:color="auto" w:val="clear"/>
+            <w:tcMar>
+              <w:top w:type="dxa" w:w="70"/>
+              <w:left w:type="dxa" w:w="110"/>
+              <w:bottom w:type="dxa" w:w="70"/>
+              <w:right w:type="dxa" w:w="110"/>
+            </w:tcMar>
+          </w:tcPr>
+          <w:p>
+            <w:pPr>
+              <w:spacing w:after="0" w:line="264"/>
+            </w:pPr>
+            <w:r>
+              <w:rPr>
+                <w:b w:val="false"/>
+                <w:bCs w:val="false"/>
+                <w:color w:val="0F172A"/>
+                <w:sz w:val="19"/>
+                <w:szCs w:val="19"/>
+              </w:rPr>
+              <w:t xml:space="preserve">Slides 1-5: introduction, problem and solution</w:t>
+            </w:r>
+          </w:p>
+        </w:tc>
+      </w:tr>
+      <w:tr>
+        <w:trPr>
+          <w:cantSplit/>
+        </w:trPr>
+        <w:tc>
+          <w:tcPr>
+            <w:tcW w:type="dxa" w:w="2100"/>
+            <w:tcBorders>
+              <w:top w:val="single" w:color="CBD5E1" w:sz="4"/>
+              <w:left w:val="single" w:color="CBD5E1" w:sz="4"/>
+              <w:bottom w:val="single" w:color="CBD5E1" w:sz="4"/>
+              <w:right w:val="single" w:color="CBD5E1" w:sz="4"/>
+            </w:tcBorders>
+            <w:shd w:fill="F8FAFC" w:color="auto" w:val="clear"/>
+            <w:tcMar>
+              <w:top w:type="dxa" w:w="70"/>
+              <w:left w:type="dxa" w:w="110"/>
+              <w:bottom w:type="dxa" w:w="70"/>
+              <w:right w:type="dxa" w:w="110"/>
+            </w:tcMar>
+          </w:tcPr>
+          <w:p>
+            <w:pPr>
+              <w:spacing w:after="0" w:line="264"/>
+            </w:pPr>
+            <w:r>
+              <w:rPr>
+                <w:b/>
+                <w:bCs/>
+                <w:color w:val="0F172A"/>
+                <w:sz w:val="19"/>
+                <w:szCs w:val="19"/>
+              </w:rPr>
+              <w:t xml:space="preserve">Humaiz Khan</w:t>
+            </w:r>
+          </w:p>
+        </w:tc>
+        <w:tc>
+          <w:tcPr>
+            <w:tcW w:type="dxa" w:w="1500"/>
+            <w:tcBorders>
+              <w:top w:val="single" w:color="CBD5E1" w:sz="4"/>
+              <w:left w:val="single" w:color="CBD5E1" w:sz="4"/>
+              <w:bottom w:val="single" w:color="CBD5E1" w:sz="4"/>
+              <w:right w:val="single" w:color="CBD5E1" w:sz="4"/>
+            </w:tcBorders>
+            <w:shd w:fill="F8FAFC" w:color="auto" w:val="clear"/>
+            <w:tcMar>
+              <w:top w:type="dxa" w:w="70"/>
+              <w:left w:type="dxa" w:w="110"/>
+              <w:bottom w:type="dxa" w:w="70"/>
+              <w:right w:type="dxa" w:w="110"/>
+            </w:tcMar>
+          </w:tcPr>
+          <w:p>
+            <w:pPr>
+              <w:spacing w:after="0" w:line="264"/>
+            </w:pPr>
+            <w:r>
+              <w:rPr>
+                <w:b/>
+                <w:bCs/>
+                <w:color w:val="0369A1"/>
+                <w:sz w:val="19"/>
+                <w:szCs w:val="19"/>
+              </w:rPr>
+              <w:t xml:space="preserve">Retail Staff</w:t>
+            </w:r>
+          </w:p>
+        </w:tc>
+        <w:tc>
+          <w:tcPr>
+            <w:tcW w:type="dxa" w:w="1500"/>
+            <w:tcBorders>
+              <w:top w:val="single" w:color="CBD5E1" w:sz="4"/>
+              <w:left w:val="single" w:color="CBD5E1" w:sz="4"/>
+              <w:bottom w:val="single" w:color="CBD5E1" w:sz="4"/>
+              <w:right w:val="single" w:color="CBD5E1" w:sz="4"/>
+            </w:tcBorders>
+            <w:shd w:fill="F8FAFC" w:color="auto" w:val="clear"/>
+            <w:tcMar>
+              <w:top w:type="dxa" w:w="70"/>
+              <w:left w:type="dxa" w:w="110"/>
+              <w:bottom w:type="dxa" w:w="70"/>
+              <w:right w:type="dxa" w:w="110"/>
+            </w:tcMar>
+          </w:tcPr>
+          <w:p>
+            <w:pPr>
+              <w:spacing w:after="0" w:line="264"/>
+            </w:pPr>
+            <w:r>
+              <w:rPr>
+                <w:b w:val="false"/>
+                <w:bCs w:val="false"/>
+                <w:color w:val="0F172A"/>
+                <w:sz w:val="19"/>
+                <w:szCs w:val="19"/>
+              </w:rPr>
+              <w:t xml:space="preserve">retail1</w:t>
+            </w:r>
+          </w:p>
+        </w:tc>
+        <w:tc>
+          <w:tcPr>
+            <w:tcW w:type="dxa" w:w="2700"/>
+            <w:tcBorders>
+              <w:top w:val="single" w:color="CBD5E1" w:sz="4"/>
+              <w:left w:val="single" w:color="CBD5E1" w:sz="4"/>
+              <w:bottom w:val="single" w:color="CBD5E1" w:sz="4"/>
+              <w:right w:val="single" w:color="CBD5E1" w:sz="4"/>
+            </w:tcBorders>
+            <w:shd w:fill="F8FAFC" w:color="auto" w:val="clear"/>
+            <w:tcMar>
+              <w:top w:type="dxa" w:w="70"/>
+              <w:left w:type="dxa" w:w="110"/>
+              <w:bottom w:type="dxa" w:w="70"/>
+              <w:right w:type="dxa" w:w="110"/>
+            </w:tcMar>
+          </w:tcPr>
+          <w:p>
+            <w:pPr>
+              <w:spacing w:after="0" w:line="264"/>
+            </w:pPr>
+            <w:r>
+              <w:rPr>
+                <w:b w:val="false"/>
+                <w:bCs w:val="false"/>
+                <w:color w:val="0F172A"/>
+                <w:sz w:val="19"/>
+                <w:szCs w:val="19"/>
+              </w:rPr>
+              <w:t xml:space="preserve">New customer, place order, collect payment</w:t>
+            </w:r>
+          </w:p>
+        </w:tc>
+        <w:tc>
+          <w:tcPr>
+            <w:tcW w:type="dxa" w:w="1838"/>
+            <w:tcBorders>
+              <w:top w:val="single" w:color="CBD5E1" w:sz="4"/>
+              <w:left w:val="single" w:color="CBD5E1" w:sz="4"/>
+              <w:bottom w:val="single" w:color="CBD5E1" w:sz="4"/>
+              <w:right w:val="single" w:color="CBD5E1" w:sz="4"/>
+            </w:tcBorders>
+            <w:shd w:fill="F8FAFC" w:color="auto" w:val="clear"/>
+            <w:tcMar>
+              <w:top w:type="dxa" w:w="70"/>
+              <w:left w:type="dxa" w:w="110"/>
+              <w:bottom w:type="dxa" w:w="70"/>
+              <w:right w:type="dxa" w:w="110"/>
+            </w:tcMar>
+          </w:tcPr>
+          <w:p>
+            <w:pPr>
+              <w:spacing w:after="0" w:line="264"/>
+            </w:pPr>
+            <w:r>
+              <w:rPr>
+                <w:b w:val="false"/>
+                <w:bCs w:val="false"/>
+                <w:color w:val="0F172A"/>
+                <w:sz w:val="19"/>
+                <w:szCs w:val="19"/>
+              </w:rPr>
+              <w:t xml:space="preserve">Slides 6-8: architecture, database and identifiers</w:t>
+            </w:r>
+          </w:p>
+        </w:tc>
+      </w:tr>
+      <w:tr>
+        <w:trPr>
+          <w:cantSplit/>
+        </w:trPr>
+        <w:tc>
+          <w:tcPr>
+            <w:tcW w:type="dxa" w:w="2100"/>
+            <w:tcBorders>
+              <w:top w:val="single" w:color="CBD5E1" w:sz="4"/>
+              <w:left w:val="single" w:color="CBD5E1" w:sz="4"/>
+              <w:bottom w:val="single" w:color="CBD5E1" w:sz="4"/>
+              <w:right w:val="single" w:color="CBD5E1" w:sz="4"/>
+            </w:tcBorders>
+            <w:shd w:fill="FFFFFF" w:color="auto" w:val="clear"/>
+            <w:tcMar>
+              <w:top w:type="dxa" w:w="70"/>
+              <w:left w:type="dxa" w:w="110"/>
+              <w:bottom w:type="dxa" w:w="70"/>
+              <w:right w:type="dxa" w:w="110"/>
+            </w:tcMar>
+          </w:tcPr>
+          <w:p>
+            <w:pPr>
+              <w:spacing w:after="0" w:line="264"/>
+            </w:pPr>
+            <w:r>
+              <w:rPr>
+                <w:b/>
+                <w:bCs/>
+                <w:color w:val="0F172A"/>
+                <w:sz w:val="19"/>
+                <w:szCs w:val="19"/>
+              </w:rPr>
+              <w:t xml:space="preserve">Muhammad Ehtisham Shakeel</w:t>
+            </w:r>
+          </w:p>
+        </w:tc>
+        <w:tc>
+          <w:tcPr>
+            <w:tcW w:type="dxa" w:w="1500"/>
+            <w:tcBorders>
+              <w:top w:val="single" w:color="CBD5E1" w:sz="4"/>
+              <w:left w:val="single" w:color="CBD5E1" w:sz="4"/>
+              <w:bottom w:val="single" w:color="CBD5E1" w:sz="4"/>
+              <w:right w:val="single" w:color="CBD5E1" w:sz="4"/>
+            </w:tcBorders>
+            <w:shd w:fill="FFFFFF" w:color="auto" w:val="clear"/>
+            <w:tcMar>
+              <w:top w:type="dxa" w:w="70"/>
+              <w:left w:type="dxa" w:w="110"/>
+              <w:bottom w:type="dxa" w:w="70"/>
+              <w:right w:type="dxa" w:w="110"/>
+            </w:tcMar>
+          </w:tcPr>
+          <w:p>
+            <w:pPr>
+              <w:spacing w:after="0" w:line="264"/>
+            </w:pPr>
+            <w:r>
+              <w:rPr>
+                <w:b/>
+                <w:bCs/>
+                <w:color w:val="0369A1"/>
+                <w:sz w:val="19"/>
+                <w:szCs w:val="19"/>
+              </w:rPr>
+              <w:t xml:space="preserve">Technical Staff</w:t>
+            </w:r>
+          </w:p>
+        </w:tc>
+        <w:tc>
+          <w:tcPr>
+            <w:tcW w:type="dxa" w:w="1500"/>
+            <w:tcBorders>
+              <w:top w:val="single" w:color="CBD5E1" w:sz="4"/>
+              <w:left w:val="single" w:color="CBD5E1" w:sz="4"/>
+              <w:bottom w:val="single" w:color="CBD5E1" w:sz="4"/>
+              <w:right w:val="single" w:color="CBD5E1" w:sz="4"/>
+            </w:tcBorders>
+            <w:shd w:fill="FFFFFF" w:color="auto" w:val="clear"/>
+            <w:tcMar>
+              <w:top w:type="dxa" w:w="70"/>
+              <w:left w:type="dxa" w:w="110"/>
+              <w:bottom w:type="dxa" w:w="70"/>
+              <w:right w:type="dxa" w:w="110"/>
+            </w:tcMar>
+          </w:tcPr>
+          <w:p>
+            <w:pPr>
+              <w:spacing w:after="0" w:line="264"/>
+            </w:pPr>
+            <w:r>
+              <w:rPr>
+                <w:b w:val="false"/>
+                <w:bCs w:val="false"/>
+                <w:color w:val="0F172A"/>
+                <w:sz w:val="19"/>
+                <w:szCs w:val="19"/>
+              </w:rPr>
+              <w:t xml:space="preserve">tech1</w:t>
+            </w:r>
+          </w:p>
+        </w:tc>
+        <w:tc>
+          <w:tcPr>
+            <w:tcW w:type="dxa" w:w="2700"/>
+            <w:tcBorders>
+              <w:top w:val="single" w:color="CBD5E1" w:sz="4"/>
+              <w:left w:val="single" w:color="CBD5E1" w:sz="4"/>
+              <w:bottom w:val="single" w:color="CBD5E1" w:sz="4"/>
+              <w:right w:val="single" w:color="CBD5E1" w:sz="4"/>
+            </w:tcBorders>
+            <w:shd w:fill="FFFFFF" w:color="auto" w:val="clear"/>
+            <w:tcMar>
+              <w:top w:type="dxa" w:w="70"/>
+              <w:left w:type="dxa" w:w="110"/>
+              <w:bottom w:type="dxa" w:w="70"/>
+              <w:right w:type="dxa" w:w="110"/>
+            </w:tcMar>
+          </w:tcPr>
+          <w:p>
+            <w:pPr>
+              <w:spacing w:after="0" w:line="264"/>
+            </w:pPr>
+            <w:r>
+              <w:rPr>
+                <w:b w:val="false"/>
+                <w:bCs w:val="false"/>
+                <w:color w:val="0F172A"/>
+                <w:sz w:val="19"/>
+                <w:szCs w:val="19"/>
+              </w:rPr>
+              <w:t xml:space="preserve">Feasibility check, provision connection, overdue / suspend</w:t>
+            </w:r>
+          </w:p>
+        </w:tc>
+        <w:tc>
+          <w:tcPr>
+            <w:tcW w:type="dxa" w:w="1838"/>
+            <w:tcBorders>
+              <w:top w:val="single" w:color="CBD5E1" w:sz="4"/>
+              <w:left w:val="single" w:color="CBD5E1" w:sz="4"/>
+              <w:bottom w:val="single" w:color="CBD5E1" w:sz="4"/>
+              <w:right w:val="single" w:color="CBD5E1" w:sz="4"/>
+            </w:tcBorders>
+            <w:shd w:fill="FFFFFF" w:color="auto" w:val="clear"/>
+            <w:tcMar>
+              <w:top w:type="dxa" w:w="70"/>
+              <w:left w:type="dxa" w:w="110"/>
+              <w:bottom w:type="dxa" w:w="70"/>
+              <w:right w:type="dxa" w:w="110"/>
+            </w:tcMar>
+          </w:tcPr>
+          <w:p>
+            <w:pPr>
+              <w:spacing w:after="0" w:line="264"/>
+            </w:pPr>
+            <w:r>
+              <w:rPr>
+                <w:b w:val="false"/>
+                <w:bCs w:val="false"/>
+                <w:color w:val="0F172A"/>
+                <w:sz w:val="19"/>
+                <w:szCs w:val="19"/>
+              </w:rPr>
+              <w:t xml:space="preserve">Slide 9 and the live demo</w:t>
+            </w:r>
+          </w:p>
+        </w:tc>
+      </w:tr>
+      <w:tr>
+        <w:trPr>
+          <w:cantSplit/>
+        </w:trPr>
+        <w:tc>
+          <w:tcPr>
+            <w:tcW w:type="dxa" w:w="2100"/>
+            <w:tcBorders>
+              <w:top w:val="single" w:color="CBD5E1" w:sz="4"/>
+              <w:left w:val="single" w:color="CBD5E1" w:sz="4"/>
+              <w:bottom w:val="single" w:color="CBD5E1" w:sz="4"/>
+              <w:right w:val="single" w:color="CBD5E1" w:sz="4"/>
+            </w:tcBorders>
+            <w:shd w:fill="F8FAFC" w:color="auto" w:val="clear"/>
+            <w:tcMar>
+              <w:top w:type="dxa" w:w="70"/>
+              <w:left w:type="dxa" w:w="110"/>
+              <w:bottom w:type="dxa" w:w="70"/>
+              <w:right w:type="dxa" w:w="110"/>
+            </w:tcMar>
+          </w:tcPr>
+          <w:p>
+            <w:pPr>
+              <w:spacing w:after="0" w:line="264"/>
+            </w:pPr>
+            <w:r>
+              <w:rPr>
+                <w:b/>
+                <w:bCs/>
+                <w:color w:val="0F172A"/>
+                <w:sz w:val="19"/>
+                <w:szCs w:val="19"/>
+              </w:rPr>
+              <w:t xml:space="preserve">Muhammad Waleed</w:t>
+            </w:r>
+          </w:p>
+        </w:tc>
+        <w:tc>
+          <w:tcPr>
+            <w:tcW w:type="dxa" w:w="1500"/>
+            <w:tcBorders>
+              <w:top w:val="single" w:color="CBD5E1" w:sz="4"/>
+              <w:left w:val="single" w:color="CBD5E1" w:sz="4"/>
+              <w:bottom w:val="single" w:color="CBD5E1" w:sz="4"/>
+              <w:right w:val="single" w:color="CBD5E1" w:sz="4"/>
+            </w:tcBorders>
+            <w:shd w:fill="F8FAFC" w:color="auto" w:val="clear"/>
+            <w:tcMar>
+              <w:top w:type="dxa" w:w="70"/>
+              <w:left w:type="dxa" w:w="110"/>
+              <w:bottom w:type="dxa" w:w="70"/>
+              <w:right w:type="dxa" w:w="110"/>
+            </w:tcMar>
+          </w:tcPr>
+          <w:p>
+            <w:pPr>
+              <w:spacing w:after="0" w:line="264"/>
+            </w:pPr>
+            <w:r>
+              <w:rPr>
+                <w:b/>
+                <w:bCs/>
+                <w:color w:val="0369A1"/>
+                <w:sz w:val="19"/>
+                <w:szCs w:val="19"/>
+              </w:rPr>
+              <w:t xml:space="preserve">Accounts Staff</w:t>
+            </w:r>
+          </w:p>
+        </w:tc>
+        <w:tc>
+          <w:tcPr>
+            <w:tcW w:type="dxa" w:w="1500"/>
+            <w:tcBorders>
+              <w:top w:val="single" w:color="CBD5E1" w:sz="4"/>
+              <w:left w:val="single" w:color="CBD5E1" w:sz="4"/>
+              <w:bottom w:val="single" w:color="CBD5E1" w:sz="4"/>
+              <w:right w:val="single" w:color="CBD5E1" w:sz="4"/>
+            </w:tcBorders>
+            <w:shd w:fill="F8FAFC" w:color="auto" w:val="clear"/>
+            <w:tcMar>
+              <w:top w:type="dxa" w:w="70"/>
+              <w:left w:type="dxa" w:w="110"/>
+              <w:bottom w:type="dxa" w:w="70"/>
+              <w:right w:type="dxa" w:w="110"/>
+            </w:tcMar>
+          </w:tcPr>
+          <w:p>
+            <w:pPr>
+              <w:spacing w:after="0" w:line="264"/>
+            </w:pPr>
+            <w:r>
+              <w:rPr>
+                <w:b w:val="false"/>
+                <w:bCs w:val="false"/>
+                <w:color w:val="0F172A"/>
+                <w:sz w:val="19"/>
+                <w:szCs w:val="19"/>
+              </w:rPr>
+              <w:t xml:space="preserve">acct1</w:t>
+            </w:r>
+          </w:p>
+        </w:tc>
+        <w:tc>
+          <w:tcPr>
+            <w:tcW w:type="dxa" w:w="2700"/>
+            <w:tcBorders>
+              <w:top w:val="single" w:color="CBD5E1" w:sz="4"/>
+              <w:left w:val="single" w:color="CBD5E1" w:sz="4"/>
+              <w:bottom w:val="single" w:color="CBD5E1" w:sz="4"/>
+              <w:right w:val="single" w:color="CBD5E1" w:sz="4"/>
+            </w:tcBorders>
+            <w:shd w:fill="F8FAFC" w:color="auto" w:val="clear"/>
+            <w:tcMar>
+              <w:top w:type="dxa" w:w="70"/>
+              <w:left w:type="dxa" w:w="110"/>
+              <w:bottom w:type="dxa" w:w="70"/>
+              <w:right w:type="dxa" w:w="110"/>
+            </w:tcMar>
+          </w:tcPr>
+          <w:p>
+            <w:pPr>
+              <w:spacing w:after="0" w:line="264"/>
+            </w:pPr>
+            <w:r>
+              <w:rPr>
+                <w:b w:val="false"/>
+                <w:bCs w:val="false"/>
+                <w:color w:val="0F172A"/>
+                <w:sz w:val="19"/>
+                <w:szCs w:val="19"/>
+              </w:rPr>
+              <w:t xml:space="preserve">Generate bill with charges preview, bills list</w:t>
+            </w:r>
+          </w:p>
+        </w:tc>
+        <w:tc>
+          <w:tcPr>
+            <w:tcW w:type="dxa" w:w="1838"/>
+            <w:tcBorders>
+              <w:top w:val="single" w:color="CBD5E1" w:sz="4"/>
+              <w:left w:val="single" w:color="CBD5E1" w:sz="4"/>
+              <w:bottom w:val="single" w:color="CBD5E1" w:sz="4"/>
+              <w:right w:val="single" w:color="CBD5E1" w:sz="4"/>
+            </w:tcBorders>
+            <w:shd w:fill="F8FAFC" w:color="auto" w:val="clear"/>
+            <w:tcMar>
+              <w:top w:type="dxa" w:w="70"/>
+              <w:left w:type="dxa" w:w="110"/>
+              <w:bottom w:type="dxa" w:w="70"/>
+              <w:right w:type="dxa" w:w="110"/>
+            </w:tcMar>
+          </w:tcPr>
+          <w:p>
+            <w:pPr>
+              <w:spacing w:after="0" w:line="264"/>
+            </w:pPr>
+            <w:r>
+              <w:rPr>
+                <w:b w:val="false"/>
+                <w:bCs w:val="false"/>
+                <w:color w:val="0F172A"/>
+                <w:sz w:val="19"/>
+                <w:szCs w:val="19"/>
+              </w:rPr>
+              <w:t xml:space="preserve">Slides 10-12: billing, plans and postpaid control</w:t>
+            </w:r>
+          </w:p>
+        </w:tc>
+      </w:tr>
+      <w:tr>
+        <w:trPr>
+          <w:cantSplit/>
+        </w:trPr>
+        <w:tc>
+          <w:tcPr>
+            <w:tcW w:type="dxa" w:w="2100"/>
+            <w:tcBorders>
+              <w:top w:val="single" w:color="CBD5E1" w:sz="4"/>
+              <w:left w:val="single" w:color="CBD5E1" w:sz="4"/>
+              <w:bottom w:val="single" w:color="CBD5E1" w:sz="4"/>
+              <w:right w:val="single" w:color="CBD5E1" w:sz="4"/>
+            </w:tcBorders>
+            <w:shd w:fill="FFFFFF" w:color="auto" w:val="clear"/>
+            <w:tcMar>
+              <w:top w:type="dxa" w:w="70"/>
+              <w:left w:type="dxa" w:w="110"/>
+              <w:bottom w:type="dxa" w:w="70"/>
+              <w:right w:type="dxa" w:w="110"/>
+            </w:tcMar>
+          </w:tcPr>
+          <w:p>
+            <w:pPr>
+              <w:spacing w:after="0" w:line="264"/>
+            </w:pPr>
+            <w:r>
+              <w:rPr>
+                <w:b/>
+                <w:bCs/>
+                <w:color w:val="0F172A"/>
+                <w:sz w:val="19"/>
+                <w:szCs w:val="19"/>
+              </w:rPr>
+              <w:t xml:space="preserve">Ali Turab</w:t>
+            </w:r>
+          </w:p>
+        </w:tc>
+        <w:tc>
+          <w:tcPr>
+            <w:tcW w:type="dxa" w:w="1500"/>
+            <w:tcBorders>
+              <w:top w:val="single" w:color="CBD5E1" w:sz="4"/>
+              <w:left w:val="single" w:color="CBD5E1" w:sz="4"/>
+              <w:bottom w:val="single" w:color="CBD5E1" w:sz="4"/>
+              <w:right w:val="single" w:color="CBD5E1" w:sz="4"/>
+            </w:tcBorders>
+            <w:shd w:fill="FFFFFF" w:color="auto" w:val="clear"/>
+            <w:tcMar>
+              <w:top w:type="dxa" w:w="70"/>
+              <w:left w:type="dxa" w:w="110"/>
+              <w:bottom w:type="dxa" w:w="70"/>
+              <w:right w:type="dxa" w:w="110"/>
+            </w:tcMar>
+          </w:tcPr>
+          <w:p>
+            <w:pPr>
+              <w:spacing w:after="0" w:line="264"/>
+            </w:pPr>
+            <w:r>
+              <w:rPr>
+                <w:b/>
+                <w:bCs/>
+                <w:color w:val="0369A1"/>
+                <w:sz w:val="19"/>
+                <w:szCs w:val="19"/>
+              </w:rPr>
+              <w:t xml:space="preserve">Customer</w:t>
+            </w:r>
+          </w:p>
+        </w:tc>
+        <w:tc>
+          <w:tcPr>
+            <w:tcW w:type="dxa" w:w="1500"/>
+            <w:tcBorders>
+              <w:top w:val="single" w:color="CBD5E1" w:sz="4"/>
+              <w:left w:val="single" w:color="CBD5E1" w:sz="4"/>
+              <w:bottom w:val="single" w:color="CBD5E1" w:sz="4"/>
+              <w:right w:val="single" w:color="CBD5E1" w:sz="4"/>
+            </w:tcBorders>
+            <w:shd w:fill="FFFFFF" w:color="auto" w:val="clear"/>
+            <w:tcMar>
+              <w:top w:type="dxa" w:w="70"/>
+              <w:left w:type="dxa" w:w="110"/>
+              <w:bottom w:type="dxa" w:w="70"/>
+              <w:right w:type="dxa" w:w="110"/>
+            </w:tcMar>
+          </w:tcPr>
+          <w:p>
+            <w:pPr>
+              <w:spacing w:after="0" w:line="264"/>
+            </w:pPr>
+            <w:r>
+              <w:rPr>
+                <w:b w:val="false"/>
+                <w:bCs w:val="false"/>
+                <w:color w:val="0F172A"/>
+                <w:sz w:val="19"/>
+                <w:szCs w:val="19"/>
+              </w:rPr>
+              <w:t xml:space="preserve">alice</w:t>
+            </w:r>
+          </w:p>
+        </w:tc>
+        <w:tc>
+          <w:tcPr>
+            <w:tcW w:type="dxa" w:w="2700"/>
+            <w:tcBorders>
+              <w:top w:val="single" w:color="CBD5E1" w:sz="4"/>
+              <w:left w:val="single" w:color="CBD5E1" w:sz="4"/>
+              <w:bottom w:val="single" w:color="CBD5E1" w:sz="4"/>
+              <w:right w:val="single" w:color="CBD5E1" w:sz="4"/>
+            </w:tcBorders>
+            <w:shd w:fill="FFFFFF" w:color="auto" w:val="clear"/>
+            <w:tcMar>
+              <w:top w:type="dxa" w:w="70"/>
+              <w:left w:type="dxa" w:w="110"/>
+              <w:bottom w:type="dxa" w:w="70"/>
+              <w:right w:type="dxa" w:w="110"/>
+            </w:tcMar>
+          </w:tcPr>
+          <w:p>
+            <w:pPr>
+              <w:spacing w:after="0" w:line="264"/>
+            </w:pPr>
+            <w:r>
+              <w:rPr>
+                <w:b w:val="false"/>
+                <w:bCs w:val="false"/>
+                <w:color w:val="0F172A"/>
+                <w:sz w:val="19"/>
+                <w:szCs w:val="19"/>
+              </w:rPr>
+              <w:t xml:space="preserve">Register, dashboard, bills, documents, light / dark theme</w:t>
+            </w:r>
+          </w:p>
+        </w:tc>
+        <w:tc>
+          <w:tcPr>
+            <w:tcW w:type="dxa" w:w="1838"/>
+            <w:tcBorders>
+              <w:top w:val="single" w:color="CBD5E1" w:sz="4"/>
+              <w:left w:val="single" w:color="CBD5E1" w:sz="4"/>
+              <w:bottom w:val="single" w:color="CBD5E1" w:sz="4"/>
+              <w:right w:val="single" w:color="CBD5E1" w:sz="4"/>
+            </w:tcBorders>
+            <w:shd w:fill="FFFFFF" w:color="auto" w:val="clear"/>
+            <w:tcMar>
+              <w:top w:type="dxa" w:w="70"/>
+              <w:left w:type="dxa" w:w="110"/>
+              <w:bottom w:type="dxa" w:w="70"/>
+              <w:right w:type="dxa" w:w="110"/>
+            </w:tcMar>
+          </w:tcPr>
+          <w:p>
+            <w:pPr>
+              <w:spacing w:after="0" w:line="264"/>
+            </w:pPr>
+            <w:r>
+              <w:rPr>
+                <w:b w:val="false"/>
+                <w:bCs w:val="false"/>
+                <w:color w:val="0F172A"/>
+                <w:sz w:val="19"/>
+                <w:szCs w:val="19"/>
+              </w:rPr>
+              <w:t xml:space="preserve">Slides 13-17: interface, quality and closing</w:t>
             </w:r>
           </w:p>
         </w:tc>
@@ -26381,7 +27569,7 @@
         <w:sz w:val="17"/>
         <w:szCs w:val="17"/>
       </w:rPr>
-      <w:t xml:space="preserve">eProject  ·  Group of 5  ·  October 2026</w:t>
+      <w:t xml:space="preserve">ADSE Semester 3  ·  Aptech Center NN2  ·  October 2026</w:t>
     </w:r>
     <w:r>
       <w:rPr>

</xml_diff>

<commit_message>
Documentation: official centre, course/term, eProject code and project period
Co-Authored-By: Claude Opus 5.5 <noreply@anthropic.com>
Claude-Session: https://claude.ai/code/session_01EGrnzrfHztmX7RAaosfXYG
</commit_message>
<xml_diff>
--- a/documentation/Nexus_Documentation/Nexus_Project_Report.docx
+++ b/documentation/Nexus_Documentation/Nexus_Project_Report.docx
@@ -55,7 +55,7 @@
       <w:r>
         <w:drawing>
           <wp:inline distT="0" distB="0" distL="0" distR="0">
-            <wp:extent cx="4095750" cy="2562225"/>
+            <wp:extent cx="3429000" cy="2143125"/>
             <wp:effectExtent t="0" r="0" b="0" l="0"/>
             <wp:docPr id="1" name="ui-home.jpg" descr="ui home jpg" title="ui-home.jpg"/>
             <wp:cNvGraphicFramePr>
@@ -80,7 +80,7 @@
                   <pic:spPr bwMode="auto">
                     <a:xfrm>
                       <a:off x="0" y="0"/>
-                      <a:ext cx="4095750" cy="2562225"/>
+                      <a:ext cx="3429000" cy="2143125"/>
                     </a:xfrm>
                     <a:prstGeom prst="rect">
                       <a:avLst/>
@@ -356,7 +356,7 @@
                 <w:sz w:val="19"/>
                 <w:szCs w:val="19"/>
               </w:rPr>
-              <w:t xml:space="preserve">Curriculum / Semester</w:t>
+              <w:t xml:space="preserve">Course / Term</w:t>
             </w:r>
           </w:p>
         </w:tc>
@@ -389,7 +389,7 @@
                 <w:sz w:val="19"/>
                 <w:szCs w:val="19"/>
               </w:rPr>
-              <w:t xml:space="preserve">ADSE - Semester 3</w:t>
+              <w:t xml:space="preserve">ADSE  ·  ACCP in AI - Term 3</w:t>
             </w:r>
           </w:p>
         </w:tc>
@@ -460,7 +460,149 @@
                 <w:sz w:val="19"/>
                 <w:szCs w:val="19"/>
               </w:rPr>
-              <w:t xml:space="preserve">Aptech Center NN2</w:t>
+              <w:t xml:space="preserve">ACE-PK-Karachi-20-North Nazimabad-2</w:t>
+            </w:r>
+          </w:p>
+        </w:tc>
+      </w:tr>
+      <w:tr>
+        <w:trPr>
+          <w:cantSplit/>
+        </w:trPr>
+        <w:tc>
+          <w:tcPr>
+            <w:tcW w:type="dxa" w:w="2600"/>
+            <w:tcBorders>
+              <w:top w:val="single" w:color="CBD5E1" w:sz="4"/>
+              <w:left w:val="single" w:color="CBD5E1" w:sz="4"/>
+              <w:bottom w:val="single" w:color="CBD5E1" w:sz="4"/>
+              <w:right w:val="single" w:color="CBD5E1" w:sz="4"/>
+            </w:tcBorders>
+            <w:shd w:fill="FFFFFF" w:color="auto" w:val="clear"/>
+            <w:tcMar>
+              <w:top w:type="dxa" w:w="70"/>
+              <w:left w:type="dxa" w:w="110"/>
+              <w:bottom w:type="dxa" w:w="70"/>
+              <w:right w:type="dxa" w:w="110"/>
+            </w:tcMar>
+          </w:tcPr>
+          <w:p>
+            <w:pPr>
+              <w:spacing w:after="0" w:line="264"/>
+            </w:pPr>
+            <w:r>
+              <w:rPr>
+                <w:b w:val="false"/>
+                <w:bCs w:val="false"/>
+                <w:color w:val="0F172A"/>
+                <w:sz w:val="19"/>
+                <w:szCs w:val="19"/>
+              </w:rPr>
+              <w:t xml:space="preserve">eProject code</w:t>
+            </w:r>
+          </w:p>
+        </w:tc>
+        <w:tc>
+          <w:tcPr>
+            <w:tcW w:type="dxa" w:w="7038"/>
+            <w:tcBorders>
+              <w:top w:val="single" w:color="CBD5E1" w:sz="4"/>
+              <w:left w:val="single" w:color="CBD5E1" w:sz="4"/>
+              <w:bottom w:val="single" w:color="CBD5E1" w:sz="4"/>
+              <w:right w:val="single" w:color="CBD5E1" w:sz="4"/>
+            </w:tcBorders>
+            <w:shd w:fill="FFFFFF" w:color="auto" w:val="clear"/>
+            <w:tcMar>
+              <w:top w:type="dxa" w:w="70"/>
+              <w:left w:type="dxa" w:w="110"/>
+              <w:bottom w:type="dxa" w:w="70"/>
+              <w:right w:type="dxa" w:w="110"/>
+            </w:tcMar>
+          </w:tcPr>
+          <w:p>
+            <w:pPr>
+              <w:spacing w:after="0" w:line="264"/>
+            </w:pPr>
+            <w:r>
+              <w:rPr>
+                <w:b w:val="false"/>
+                <w:bCs w:val="false"/>
+                <w:color w:val="0F172A"/>
+                <w:sz w:val="19"/>
+                <w:szCs w:val="19"/>
+              </w:rPr>
+              <w:t xml:space="preserve">EPROJECT00503</w:t>
+            </w:r>
+          </w:p>
+        </w:tc>
+      </w:tr>
+      <w:tr>
+        <w:trPr>
+          <w:cantSplit/>
+        </w:trPr>
+        <w:tc>
+          <w:tcPr>
+            <w:tcW w:type="dxa" w:w="2600"/>
+            <w:tcBorders>
+              <w:top w:val="single" w:color="CBD5E1" w:sz="4"/>
+              <w:left w:val="single" w:color="CBD5E1" w:sz="4"/>
+              <w:bottom w:val="single" w:color="CBD5E1" w:sz="4"/>
+              <w:right w:val="single" w:color="CBD5E1" w:sz="4"/>
+            </w:tcBorders>
+            <w:shd w:fill="F8FAFC" w:color="auto" w:val="clear"/>
+            <w:tcMar>
+              <w:top w:type="dxa" w:w="70"/>
+              <w:left w:type="dxa" w:w="110"/>
+              <w:bottom w:type="dxa" w:w="70"/>
+              <w:right w:type="dxa" w:w="110"/>
+            </w:tcMar>
+          </w:tcPr>
+          <w:p>
+            <w:pPr>
+              <w:spacing w:after="0" w:line="264"/>
+            </w:pPr>
+            <w:r>
+              <w:rPr>
+                <w:b w:val="false"/>
+                <w:bCs w:val="false"/>
+                <w:color w:val="0F172A"/>
+                <w:sz w:val="19"/>
+                <w:szCs w:val="19"/>
+              </w:rPr>
+              <w:t xml:space="preserve">Project period</w:t>
+            </w:r>
+          </w:p>
+        </w:tc>
+        <w:tc>
+          <w:tcPr>
+            <w:tcW w:type="dxa" w:w="7038"/>
+            <w:tcBorders>
+              <w:top w:val="single" w:color="CBD5E1" w:sz="4"/>
+              <w:left w:val="single" w:color="CBD5E1" w:sz="4"/>
+              <w:bottom w:val="single" w:color="CBD5E1" w:sz="4"/>
+              <w:right w:val="single" w:color="CBD5E1" w:sz="4"/>
+            </w:tcBorders>
+            <w:shd w:fill="F8FAFC" w:color="auto" w:val="clear"/>
+            <w:tcMar>
+              <w:top w:type="dxa" w:w="70"/>
+              <w:left w:type="dxa" w:w="110"/>
+              <w:bottom w:type="dxa" w:w="70"/>
+              <w:right w:type="dxa" w:w="110"/>
+            </w:tcMar>
+          </w:tcPr>
+          <w:p>
+            <w:pPr>
+              <w:spacing w:after="0" w:line="264"/>
+            </w:pPr>
+            <w:r>
+              <w:rPr>
+                <w:b w:val="false"/>
+                <w:bCs w:val="false"/>
+                <w:color w:val="0F172A"/>
+                <w:sz w:val="19"/>
+                <w:szCs w:val="19"/>
+              </w:rPr>
+              <w:t xml:space="preserve">17 Sep 2026 - 17 Oct 2026 (30 days)</w:t>
             </w:r>
           </w:p>
         </w:tc>
@@ -2139,7 +2281,7 @@
         <w:spacing w:after="120" w:line="288"/>
       </w:pPr>
       <w:r>
-        <w:t xml:space="preserve">Nexus Service Marketing System was built by a team of 5 students of ADSE Semester 3, Aptech Center NN2. Every member took part in analysis, testing and the final review; the table shows each member's main area.</w:t>
+        <w:t xml:space="preserve">Nexus Service Marketing System was built by a team of 5 students of ADSE (ACCP in AI - Term 3), Aptech North Nazimabad-2. Every member took part in analysis, testing and the final review; the table shows each member's main area.</w:t>
       </w:r>
     </w:p>
     <w:tbl>
@@ -27569,7 +27711,7 @@
         <w:sz w:val="17"/>
         <w:szCs w:val="17"/>
       </w:rPr>
-      <w:t xml:space="preserve">ADSE Semester 3  ·  Aptech Center NN2  ·  October 2026</w:t>
+      <w:t xml:space="preserve">ADSE Term 3  ·  Aptech North Nazimabad-2  ·  EPROJECT00503</w:t>
     </w:r>
     <w:r>
       <w:rPr>

</xml_diff>

<commit_message>
Documentation: faculty mentor and status-mail dates
Co-Authored-By: Claude Opus 5.5 <noreply@anthropic.com>
Claude-Session: https://claude.ai/code/session_01EGrnzrfHztmX7RAaosfXYG
</commit_message>
<xml_diff>
--- a/documentation/Nexus_Documentation/Nexus_Project_Report.docx
+++ b/documentation/Nexus_Documentation/Nexus_Project_Report.docx
@@ -35,7 +35,7 @@
     </w:p>
     <w:p>
       <w:pPr>
-        <w:spacing w:after="360"/>
+        <w:spacing w:after="200"/>
       </w:pPr>
       <w:r>
         <w:rPr>
@@ -55,7 +55,7 @@
       <w:r>
         <w:drawing>
           <wp:inline distT="0" distB="0" distL="0" distR="0">
-            <wp:extent cx="3429000" cy="2143125"/>
+            <wp:extent cx="2857500" cy="1790700"/>
             <wp:effectExtent t="0" r="0" b="0" l="0"/>
             <wp:docPr id="1" name="ui-home.jpg" descr="ui home jpg" title="ui-home.jpg"/>
             <wp:cNvGraphicFramePr>
@@ -80,7 +80,7 @@
                   <pic:spPr bwMode="auto">
                     <a:xfrm>
                       <a:off x="0" y="0"/>
-                      <a:ext cx="3429000" cy="2143125"/>
+                      <a:ext cx="2857500" cy="1790700"/>
                     </a:xfrm>
                     <a:prstGeom prst="rect">
                       <a:avLst/>
@@ -569,7 +569,7 @@
                 <w:sz w:val="19"/>
                 <w:szCs w:val="19"/>
               </w:rPr>
-              <w:t xml:space="preserve">Project period</w:t>
+              <w:t xml:space="preserve">Faculty mentor</w:t>
             </w:r>
           </w:p>
         </w:tc>
@@ -602,7 +602,7 @@
                 <w:sz w:val="19"/>
                 <w:szCs w:val="19"/>
               </w:rPr>
-              <w:t xml:space="preserve">17 Sep 2026 - 17 Oct 2026 (30 days)</w:t>
+              <w:t xml:space="preserve">Sir Zafeer Ansari</w:t>
             </w:r>
           </w:p>
         </w:tc>
@@ -640,7 +640,7 @@
                 <w:sz w:val="19"/>
                 <w:szCs w:val="19"/>
               </w:rPr>
-              <w:t xml:space="preserve">Project type</w:t>
+              <w:t xml:space="preserve">Project period</w:t>
             </w:r>
           </w:p>
         </w:tc>
@@ -673,7 +673,7 @@
                 <w:sz w:val="19"/>
                 <w:szCs w:val="19"/>
               </w:rPr>
-              <w:t xml:space="preserve">Group eProject - 5 members</w:t>
+              <w:t xml:space="preserve">17 Sep 2026 - 17 Oct 2026 (30 days)</w:t>
             </w:r>
           </w:p>
         </w:tc>
@@ -711,6 +711,77 @@
                 <w:sz w:val="19"/>
                 <w:szCs w:val="19"/>
               </w:rPr>
+              <w:t xml:space="preserve">Project type</w:t>
+            </w:r>
+          </w:p>
+        </w:tc>
+        <w:tc>
+          <w:tcPr>
+            <w:tcW w:type="dxa" w:w="7038"/>
+            <w:tcBorders>
+              <w:top w:val="single" w:color="CBD5E1" w:sz="4"/>
+              <w:left w:val="single" w:color="CBD5E1" w:sz="4"/>
+              <w:bottom w:val="single" w:color="CBD5E1" w:sz="4"/>
+              <w:right w:val="single" w:color="CBD5E1" w:sz="4"/>
+            </w:tcBorders>
+            <w:shd w:fill="F8FAFC" w:color="auto" w:val="clear"/>
+            <w:tcMar>
+              <w:top w:type="dxa" w:w="70"/>
+              <w:left w:type="dxa" w:w="110"/>
+              <w:bottom w:type="dxa" w:w="70"/>
+              <w:right w:type="dxa" w:w="110"/>
+            </w:tcMar>
+          </w:tcPr>
+          <w:p>
+            <w:pPr>
+              <w:spacing w:after="0" w:line="264"/>
+            </w:pPr>
+            <w:r>
+              <w:rPr>
+                <w:b w:val="false"/>
+                <w:bCs w:val="false"/>
+                <w:color w:val="0F172A"/>
+                <w:sz w:val="19"/>
+                <w:szCs w:val="19"/>
+              </w:rPr>
+              <w:t xml:space="preserve">Group eProject - 5 members</w:t>
+            </w:r>
+          </w:p>
+        </w:tc>
+      </w:tr>
+      <w:tr>
+        <w:trPr>
+          <w:cantSplit/>
+        </w:trPr>
+        <w:tc>
+          <w:tcPr>
+            <w:tcW w:type="dxa" w:w="2600"/>
+            <w:tcBorders>
+              <w:top w:val="single" w:color="CBD5E1" w:sz="4"/>
+              <w:left w:val="single" w:color="CBD5E1" w:sz="4"/>
+              <w:bottom w:val="single" w:color="CBD5E1" w:sz="4"/>
+              <w:right w:val="single" w:color="CBD5E1" w:sz="4"/>
+            </w:tcBorders>
+            <w:shd w:fill="FFFFFF" w:color="auto" w:val="clear"/>
+            <w:tcMar>
+              <w:top w:type="dxa" w:w="70"/>
+              <w:left w:type="dxa" w:w="110"/>
+              <w:bottom w:type="dxa" w:w="70"/>
+              <w:right w:type="dxa" w:w="110"/>
+            </w:tcMar>
+          </w:tcPr>
+          <w:p>
+            <w:pPr>
+              <w:spacing w:after="0" w:line="264"/>
+            </w:pPr>
+            <w:r>
+              <w:rPr>
+                <w:b w:val="false"/>
+                <w:bCs w:val="false"/>
+                <w:color w:val="0F172A"/>
+                <w:sz w:val="19"/>
+                <w:szCs w:val="19"/>
+              </w:rPr>
               <w:t xml:space="preserve">Submission</w:t>
             </w:r>
           </w:p>
@@ -724,7 +795,7 @@
               <w:bottom w:val="single" w:color="CBD5E1" w:sz="4"/>
               <w:right w:val="single" w:color="CBD5E1" w:sz="4"/>
             </w:tcBorders>
-            <w:shd w:fill="F8FAFC" w:color="auto" w:val="clear"/>
+            <w:shd w:fill="FFFFFF" w:color="auto" w:val="clear"/>
             <w:tcMar>
               <w:top w:type="dxa" w:w="70"/>
               <w:left w:type="dxa" w:w="110"/>
@@ -2202,6 +2273,16 @@
             <w:pPr>
               <w:spacing w:after="0" w:line="264"/>
             </w:pPr>
+            <w:r>
+              <w:rPr>
+                <w:b w:val="false"/>
+                <w:bCs w:val="false"/>
+                <w:color w:val="0F172A"/>
+                <w:sz w:val="19"/>
+                <w:szCs w:val="19"/>
+              </w:rPr>
+              <w:t xml:space="preserve">Sir Zafeer Ansari</w:t>
+            </w:r>
           </w:p>
           <w:p>
             <w:pPr>

</xml_diff>